<commit_message>
docs: actualizar manuales con instrucciones paso a paso para la base de datos
</commit_message>
<xml_diff>
--- a/GUIA_INSTALACION.docx
+++ b/GUIA_INSTALACION.docx
@@ -5,56 +5,63 @@
     <w:p>
       <w:pPr>
         <w:pStyle w:val="Ttulo1"/>
-        <w:rPr>
-          <w:rFonts w:ascii="Arial" w:eastAsia="Times New Roman" w:hAnsi="Arial" w:cs="Arial"/>
-        </w:rPr>
-      </w:pPr>
-      <w:r>
-        <w:rPr>
-          <w:rFonts w:ascii="Arial" w:eastAsia="Times New Roman" w:hAnsi="Arial" w:cs="Arial"/>
-        </w:rPr>
-        <w:t>Guía de Instalación y Despliegue - CRM UNIMAQ S.A.C.</w:t>
+        <w:divId w:val="1408185825"/>
+        <w:rPr>
+          <w:rFonts w:ascii="Segoe UI" w:eastAsia="Times New Roman" w:hAnsi="Segoe UI" w:cs="Segoe UI"/>
+        </w:rPr>
+      </w:pPr>
+      <w:r>
+        <w:rPr>
+          <w:rFonts w:ascii="Segoe UI" w:eastAsia="Times New Roman" w:hAnsi="Segoe UI" w:cs="Segoe UI"/>
+        </w:rPr>
+        <w:t>Guía de Instalación y Despliegue (Paso a Paso) - CRM UNIMAQ S.A.C.</w:t>
       </w:r>
     </w:p>
     <w:p>
       <w:pPr>
         <w:pStyle w:val="NormalWeb"/>
-        <w:rPr>
-          <w:rFonts w:ascii="Arial" w:hAnsi="Arial" w:cs="Arial"/>
-        </w:rPr>
-      </w:pPr>
-      <w:r>
-        <w:rPr>
-          <w:rFonts w:ascii="Arial" w:hAnsi="Arial" w:cs="Arial"/>
-        </w:rPr>
-        <w:t xml:space="preserve">Este documento describe los requisitos y los pasos exactos para instalar, configurar y desplegar el </w:t>
+        <w:divId w:val="1408185825"/>
+        <w:rPr>
+          <w:rFonts w:ascii="Segoe UI" w:hAnsi="Segoe UI" w:cs="Segoe UI"/>
+          <w:color w:val="333333"/>
+        </w:rPr>
+      </w:pPr>
+      <w:r>
+        <w:rPr>
+          <w:rFonts w:ascii="Segoe UI" w:hAnsi="Segoe UI" w:cs="Segoe UI"/>
+          <w:color w:val="333333"/>
+        </w:rPr>
+        <w:t xml:space="preserve">Este documento describe los requisitos y los pasos exactos y detallados para instalar, configurar y desplegar el </w:t>
       </w:r>
       <w:r>
         <w:rPr>
           <w:rStyle w:val="Fuerte"/>
-          <w:rFonts w:ascii="Arial" w:hAnsi="Arial" w:cs="Arial"/>
+          <w:rFonts w:ascii="Segoe UI" w:hAnsi="Segoe UI" w:cs="Segoe UI"/>
+          <w:color w:val="333333"/>
         </w:rPr>
         <w:t>Sistema Web de Gestión de Clientes y Ventas (CRM)</w:t>
       </w:r>
       <w:r>
         <w:rPr>
-          <w:rFonts w:ascii="Arial" w:hAnsi="Arial" w:cs="Arial"/>
-        </w:rPr>
-        <w:t xml:space="preserve"> de UNIMAQ S.A.C.</w:t>
+          <w:rFonts w:ascii="Segoe UI" w:hAnsi="Segoe UI" w:cs="Segoe UI"/>
+          <w:color w:val="333333"/>
+        </w:rPr>
+        <w:t xml:space="preserve"> de UNIMAQ S.A.C., asumiendo un entorno completamente desde cero en una computadora nueva.</w:t>
       </w:r>
     </w:p>
     <w:p>
       <w:pPr>
         <w:pStyle w:val="Ttulo2"/>
-        <w:rPr>
-          <w:rFonts w:ascii="Arial" w:eastAsia="Times New Roman" w:hAnsi="Arial" w:cs="Arial"/>
-        </w:rPr>
-      </w:pPr>
-      <w:r>
-        <w:rPr>
-          <w:rFonts w:ascii="Arial" w:eastAsia="Times New Roman" w:hAnsi="Arial" w:cs="Arial"/>
-        </w:rPr>
-        <w:t>1. Requisitos Previos del Sistema</w:t>
+        <w:divId w:val="1408185825"/>
+        <w:rPr>
+          <w:rFonts w:ascii="Segoe UI" w:eastAsia="Times New Roman" w:hAnsi="Segoe UI" w:cs="Segoe UI"/>
+        </w:rPr>
+      </w:pPr>
+      <w:r>
+        <w:rPr>
+          <w:rFonts w:ascii="Segoe UI" w:eastAsia="Times New Roman" w:hAnsi="Segoe UI" w:cs="Segoe UI"/>
+        </w:rPr>
+        <w:t>1. Requisitos Previos</w:t>
       </w:r>
     </w:p>
     <w:p>
@@ -63,23 +70,27 @@
           <w:ilvl w:val="0"/>
           <w:numId w:val="1"/>
         </w:numPr>
-        <w:spacing w:before="100" w:beforeAutospacing="1" w:after="100" w:afterAutospacing="1"/>
-        <w:rPr>
-          <w:rFonts w:ascii="Arial" w:eastAsia="Times New Roman" w:hAnsi="Arial" w:cs="Arial"/>
+        <w:spacing w:before="100" w:beforeAutospacing="1" w:after="120"/>
+        <w:divId w:val="1408185825"/>
+        <w:rPr>
+          <w:rFonts w:ascii="Segoe UI" w:eastAsia="Times New Roman" w:hAnsi="Segoe UI" w:cs="Segoe UI"/>
+          <w:color w:val="333333"/>
         </w:rPr>
       </w:pPr>
       <w:r>
         <w:rPr>
           <w:rStyle w:val="Fuerte"/>
-          <w:rFonts w:ascii="Arial" w:eastAsia="Times New Roman" w:hAnsi="Arial" w:cs="Arial"/>
-        </w:rPr>
-        <w:t>Servidor Web:</w:t>
-      </w:r>
-      <w:r>
-        <w:rPr>
-          <w:rFonts w:ascii="Arial" w:eastAsia="Times New Roman" w:hAnsi="Arial" w:cs="Arial"/>
-        </w:rPr>
-        <w:t xml:space="preserve"> Apache o Nginx.</w:t>
+          <w:rFonts w:ascii="Segoe UI" w:eastAsia="Times New Roman" w:hAnsi="Segoe UI" w:cs="Segoe UI"/>
+          <w:color w:val="333333"/>
+        </w:rPr>
+        <w:t>Entorno de Servidor:</w:t>
+      </w:r>
+      <w:r>
+        <w:rPr>
+          <w:rFonts w:ascii="Segoe UI" w:eastAsia="Times New Roman" w:hAnsi="Segoe UI" w:cs="Segoe UI"/>
+          <w:color w:val="333333"/>
+        </w:rPr>
+        <w:t xml:space="preserve"> XAMPP instalado (que incluye Apache y MySQL).</w:t>
       </w:r>
     </w:p>
     <w:p>
@@ -88,23 +99,27 @@
           <w:ilvl w:val="0"/>
           <w:numId w:val="1"/>
         </w:numPr>
-        <w:spacing w:before="100" w:beforeAutospacing="1" w:after="100" w:afterAutospacing="1"/>
-        <w:rPr>
-          <w:rFonts w:ascii="Arial" w:eastAsia="Times New Roman" w:hAnsi="Arial" w:cs="Arial"/>
+        <w:spacing w:before="100" w:beforeAutospacing="1" w:after="120"/>
+        <w:divId w:val="1408185825"/>
+        <w:rPr>
+          <w:rFonts w:ascii="Segoe UI" w:eastAsia="Times New Roman" w:hAnsi="Segoe UI" w:cs="Segoe UI"/>
+          <w:color w:val="333333"/>
         </w:rPr>
       </w:pPr>
       <w:r>
         <w:rPr>
           <w:rStyle w:val="Fuerte"/>
-          <w:rFonts w:ascii="Arial" w:eastAsia="Times New Roman" w:hAnsi="Arial" w:cs="Arial"/>
-        </w:rPr>
-        <w:t>PHP:</w:t>
-      </w:r>
-      <w:r>
-        <w:rPr>
-          <w:rFonts w:ascii="Arial" w:eastAsia="Times New Roman" w:hAnsi="Arial" w:cs="Arial"/>
-        </w:rPr>
-        <w:t xml:space="preserve"> Versión 8.1 o superior.</w:t>
+          <w:rFonts w:ascii="Segoe UI" w:eastAsia="Times New Roman" w:hAnsi="Segoe UI" w:cs="Segoe UI"/>
+          <w:color w:val="333333"/>
+        </w:rPr>
+        <w:t>Versión de PHP:</w:t>
+      </w:r>
+      <w:r>
+        <w:rPr>
+          <w:rFonts w:ascii="Segoe UI" w:eastAsia="Times New Roman" w:hAnsi="Segoe UI" w:cs="Segoe UI"/>
+          <w:color w:val="333333"/>
+        </w:rPr>
+        <w:t xml:space="preserve"> 8.1 o superior.</w:t>
       </w:r>
     </w:p>
     <w:p>
@@ -113,339 +128,1155 @@
           <w:ilvl w:val="0"/>
           <w:numId w:val="1"/>
         </w:numPr>
-        <w:spacing w:before="100" w:beforeAutospacing="1" w:after="100" w:afterAutospacing="1"/>
-        <w:rPr>
-          <w:rFonts w:ascii="Arial" w:eastAsia="Times New Roman" w:hAnsi="Arial" w:cs="Arial"/>
+        <w:spacing w:before="100" w:beforeAutospacing="1" w:after="120"/>
+        <w:divId w:val="1408185825"/>
+        <w:rPr>
+          <w:rFonts w:ascii="Segoe UI" w:eastAsia="Times New Roman" w:hAnsi="Segoe UI" w:cs="Segoe UI"/>
+          <w:color w:val="333333"/>
         </w:rPr>
       </w:pPr>
       <w:r>
         <w:rPr>
           <w:rStyle w:val="Fuerte"/>
-          <w:rFonts w:ascii="Arial" w:eastAsia="Times New Roman" w:hAnsi="Arial" w:cs="Arial"/>
-        </w:rPr>
-        <w:t>Extensiones de PHP requeridas:</w:t>
-      </w:r>
-      <w:r>
-        <w:rPr>
-          <w:rFonts w:ascii="Arial" w:eastAsia="Times New Roman" w:hAnsi="Arial" w:cs="Arial"/>
-        </w:rPr>
-        <w:t xml:space="preserve"> pdo_mysql, mbstring, openssl, gd, zip.</w:t>
+          <w:rFonts w:ascii="Segoe UI" w:eastAsia="Times New Roman" w:hAnsi="Segoe UI" w:cs="Segoe UI"/>
+          <w:color w:val="333333"/>
+        </w:rPr>
+        <w:t>Gestor de Paquetes:</w:t>
+      </w:r>
+      <w:r>
+        <w:rPr>
+          <w:rFonts w:ascii="Segoe UI" w:eastAsia="Times New Roman" w:hAnsi="Segoe UI" w:cs="Segoe UI"/>
+          <w:color w:val="333333"/>
+        </w:rPr>
+        <w:t xml:space="preserve"> Composer instalado globalmente en la computadora.</w:t>
+      </w:r>
+    </w:p>
+    <w:p>
+      <w:pPr>
+        <w:shd w:val="clear" w:color="auto" w:fill="FFF3CD"/>
+        <w:divId w:val="194511125"/>
+        <w:rPr>
+          <w:rFonts w:ascii="Segoe UI" w:eastAsia="Times New Roman" w:hAnsi="Segoe UI" w:cs="Segoe UI"/>
+          <w:color w:val="856404"/>
+        </w:rPr>
+      </w:pPr>
+      <w:r>
+        <w:rPr>
+          <w:rStyle w:val="Fuerte"/>
+          <w:rFonts w:ascii="Segoe UI" w:eastAsia="Times New Roman" w:hAnsi="Segoe UI" w:cs="Segoe UI"/>
+          <w:color w:val="856404"/>
+        </w:rPr>
+        <w:t>Aviso Importante sobre Extensiones PHP:</w:t>
+      </w:r>
+      <w:r>
+        <w:rPr>
+          <w:rFonts w:ascii="Segoe UI" w:eastAsia="Times New Roman" w:hAnsi="Segoe UI" w:cs="Segoe UI"/>
+          <w:color w:val="856404"/>
+        </w:rPr>
+        <w:t xml:space="preserve"> Para que el sistema pueda exportar los reportes a Excel, debe abrir el panel de control de XAMPP, hacer clic en </w:t>
+      </w:r>
+      <w:r>
+        <w:rPr>
+          <w:rStyle w:val="Fuerte"/>
+          <w:rFonts w:ascii="Segoe UI" w:eastAsia="Times New Roman" w:hAnsi="Segoe UI" w:cs="Segoe UI"/>
+          <w:color w:val="856404"/>
+        </w:rPr>
+        <w:t>Config</w:t>
+      </w:r>
+      <w:r>
+        <w:rPr>
+          <w:rFonts w:ascii="Segoe UI" w:eastAsia="Times New Roman" w:hAnsi="Segoe UI" w:cs="Segoe UI"/>
+          <w:color w:val="856404"/>
+        </w:rPr>
+        <w:t xml:space="preserve"> en la fila de Apache, seleccionar </w:t>
+      </w:r>
+      <w:r>
+        <w:rPr>
+          <w:rStyle w:val="Fuerte"/>
+          <w:rFonts w:ascii="Segoe UI" w:eastAsia="Times New Roman" w:hAnsi="Segoe UI" w:cs="Segoe UI"/>
+          <w:color w:val="856404"/>
+        </w:rPr>
+        <w:t>PHP (php.ini)</w:t>
+      </w:r>
+      <w:r>
+        <w:rPr>
+          <w:rFonts w:ascii="Segoe UI" w:eastAsia="Times New Roman" w:hAnsi="Segoe UI" w:cs="Segoe UI"/>
+          <w:color w:val="856404"/>
+        </w:rPr>
+        <w:t xml:space="preserve"> y verificar que las líneas </w:t>
+      </w:r>
+      <w:r>
+        <w:rPr>
+          <w:rStyle w:val="CdigoHTML"/>
+        </w:rPr>
+        <w:t>extension=gd</w:t>
+      </w:r>
+      <w:r>
+        <w:rPr>
+          <w:rFonts w:ascii="Segoe UI" w:eastAsia="Times New Roman" w:hAnsi="Segoe UI" w:cs="Segoe UI"/>
+          <w:color w:val="856404"/>
+        </w:rPr>
+        <w:t xml:space="preserve"> y </w:t>
+      </w:r>
+      <w:r>
+        <w:rPr>
+          <w:rStyle w:val="CdigoHTML"/>
+        </w:rPr>
+        <w:t>extension=zip</w:t>
+      </w:r>
+      <w:r>
+        <w:rPr>
+          <w:rFonts w:ascii="Segoe UI" w:eastAsia="Times New Roman" w:hAnsi="Segoe UI" w:cs="Segoe UI"/>
+          <w:color w:val="856404"/>
+        </w:rPr>
+        <w:t xml:space="preserve"> NO tengan un punto y coma (;) al inicio. Si lo tienen, bórrelo, guarde el archivo y reinicie Apache. </w:t>
+      </w:r>
+    </w:p>
+    <w:p>
+      <w:pPr>
+        <w:pStyle w:val="Ttulo2"/>
+        <w:divId w:val="1408185825"/>
+        <w:rPr>
+          <w:rFonts w:ascii="Segoe UI" w:eastAsia="Times New Roman" w:hAnsi="Segoe UI" w:cs="Segoe UI"/>
+        </w:rPr>
+      </w:pPr>
+      <w:r>
+        <w:rPr>
+          <w:rFonts w:ascii="Segoe UI" w:eastAsia="Times New Roman" w:hAnsi="Segoe UI" w:cs="Segoe UI"/>
+        </w:rPr>
+        <w:t>2. Preparación de los Archivos del Proyecto</w:t>
       </w:r>
     </w:p>
     <w:p>
       <w:pPr>
         <w:numPr>
           <w:ilvl w:val="0"/>
-          <w:numId w:val="1"/>
+          <w:numId w:val="2"/>
         </w:numPr>
-        <w:spacing w:before="100" w:beforeAutospacing="1" w:after="100" w:afterAutospacing="1"/>
-        <w:rPr>
-          <w:rFonts w:ascii="Arial" w:eastAsia="Times New Roman" w:hAnsi="Arial" w:cs="Arial"/>
-        </w:rPr>
-      </w:pPr>
-      <w:r>
-        <w:rPr>
-          <w:rStyle w:val="Fuerte"/>
-          <w:rFonts w:ascii="Arial" w:eastAsia="Times New Roman" w:hAnsi="Arial" w:cs="Arial"/>
-        </w:rPr>
-        <w:t>Base de Datos:</w:t>
-      </w:r>
-      <w:r>
-        <w:rPr>
-          <w:rFonts w:ascii="Arial" w:eastAsia="Times New Roman" w:hAnsi="Arial" w:cs="Arial"/>
-        </w:rPr>
-        <w:t xml:space="preserve"> MySQL 5.7+ o MariaDB 10.3+.</w:t>
+        <w:spacing w:before="100" w:beforeAutospacing="1" w:after="120"/>
+        <w:divId w:val="1408185825"/>
+        <w:rPr>
+          <w:rFonts w:ascii="Segoe UI" w:eastAsia="Times New Roman" w:hAnsi="Segoe UI" w:cs="Segoe UI"/>
+          <w:color w:val="333333"/>
+        </w:rPr>
+      </w:pPr>
+      <w:r>
+        <w:rPr>
+          <w:rFonts w:ascii="Segoe UI" w:eastAsia="Times New Roman" w:hAnsi="Segoe UI" w:cs="Segoe UI"/>
+          <w:color w:val="333333"/>
+        </w:rPr>
+        <w:t xml:space="preserve">Copie la carpeta entera del proyecto (llamada </w:t>
+      </w:r>
+      <w:r>
+        <w:rPr>
+          <w:rStyle w:val="CdigoHTML"/>
+        </w:rPr>
+        <w:t>unimaq-crm</w:t>
+      </w:r>
+      <w:r>
+        <w:rPr>
+          <w:rFonts w:ascii="Segoe UI" w:eastAsia="Times New Roman" w:hAnsi="Segoe UI" w:cs="Segoe UI"/>
+          <w:color w:val="333333"/>
+        </w:rPr>
+        <w:t xml:space="preserve">) y péguela dentro del directorio público de su servidor local. Si usa XAMPP, la ruta exacta debe ser: </w:t>
+      </w:r>
+      <w:r>
+        <w:rPr>
+          <w:rStyle w:val="CdigoHTML"/>
+        </w:rPr>
+        <w:t>C:\xampp\htdocs\unimaq-crm</w:t>
+      </w:r>
+      <w:r>
+        <w:rPr>
+          <w:rFonts w:ascii="Segoe UI" w:eastAsia="Times New Roman" w:hAnsi="Segoe UI" w:cs="Segoe UI"/>
+          <w:color w:val="333333"/>
+        </w:rPr>
+        <w:t>.</w:t>
       </w:r>
     </w:p>
     <w:p>
       <w:pPr>
         <w:numPr>
           <w:ilvl w:val="0"/>
-          <w:numId w:val="1"/>
+          <w:numId w:val="2"/>
         </w:numPr>
-        <w:spacing w:before="100" w:beforeAutospacing="1" w:after="100" w:afterAutospacing="1"/>
-        <w:rPr>
-          <w:rFonts w:ascii="Arial" w:eastAsia="Times New Roman" w:hAnsi="Arial" w:cs="Arial"/>
-        </w:rPr>
-      </w:pPr>
+        <w:spacing w:before="100" w:beforeAutospacing="1" w:after="120"/>
+        <w:divId w:val="1408185825"/>
+        <w:rPr>
+          <w:rFonts w:ascii="Segoe UI" w:eastAsia="Times New Roman" w:hAnsi="Segoe UI" w:cs="Segoe UI"/>
+          <w:color w:val="333333"/>
+        </w:rPr>
+      </w:pPr>
+      <w:r>
+        <w:rPr>
+          <w:rFonts w:ascii="Segoe UI" w:eastAsia="Times New Roman" w:hAnsi="Segoe UI" w:cs="Segoe UI"/>
+          <w:color w:val="333333"/>
+        </w:rPr>
+        <w:t xml:space="preserve">Abra su programa de consola (Símbolo del sistema, PowerShell o Terminal de VSCode) y navegue hacia esa carpeta ejecutando: </w:t>
+      </w:r>
+    </w:p>
+    <w:p>
+      <w:pPr>
+        <w:pStyle w:val="HTMLconformatoprevio"/>
+        <w:ind w:left="720"/>
+        <w:divId w:val="1408185825"/>
+        <w:rPr>
+          <w:color w:val="333333"/>
+        </w:rPr>
+      </w:pPr>
+      <w:r>
+        <w:rPr>
+          <w:rStyle w:val="CdigoHTML"/>
+        </w:rPr>
+        <w:t>cd C:\xampp\htdocs\unimaq-crm</w:t>
+      </w:r>
+    </w:p>
+    <w:p>
+      <w:pPr>
+        <w:numPr>
+          <w:ilvl w:val="0"/>
+          <w:numId w:val="2"/>
+        </w:numPr>
+        <w:spacing w:before="100" w:beforeAutospacing="1" w:after="120"/>
+        <w:divId w:val="1408185825"/>
+        <w:rPr>
+          <w:rFonts w:ascii="Segoe UI" w:eastAsia="Times New Roman" w:hAnsi="Segoe UI" w:cs="Segoe UI"/>
+          <w:color w:val="333333"/>
+        </w:rPr>
+      </w:pPr>
+      <w:r>
+        <w:rPr>
+          <w:rFonts w:ascii="Segoe UI" w:eastAsia="Times New Roman" w:hAnsi="Segoe UI" w:cs="Segoe UI"/>
+          <w:color w:val="333333"/>
+        </w:rPr>
+        <w:lastRenderedPageBreak/>
+        <w:t xml:space="preserve">Ejecute el siguiente comando para descargar todas las librerías internas del framework Laravel (esto creará la carpeta </w:t>
+      </w:r>
+      <w:r>
+        <w:rPr>
+          <w:rFonts w:ascii="Segoe UI" w:eastAsia="Times New Roman" w:hAnsi="Segoe UI" w:cs="Segoe UI"/>
+          <w:i/>
+          <w:iCs/>
+          <w:color w:val="333333"/>
+        </w:rPr>
+        <w:t>vendor</w:t>
+      </w:r>
+      <w:r>
+        <w:rPr>
+          <w:rFonts w:ascii="Segoe UI" w:eastAsia="Times New Roman" w:hAnsi="Segoe UI" w:cs="Segoe UI"/>
+          <w:color w:val="333333"/>
+        </w:rPr>
+        <w:t xml:space="preserve">): </w:t>
+      </w:r>
+    </w:p>
+    <w:p>
+      <w:pPr>
+        <w:pStyle w:val="HTMLconformatoprevio"/>
+        <w:ind w:left="720"/>
+        <w:divId w:val="1408185825"/>
+        <w:rPr>
+          <w:color w:val="333333"/>
+        </w:rPr>
+      </w:pPr>
+      <w:r>
+        <w:rPr>
+          <w:rStyle w:val="CdigoHTML"/>
+        </w:rPr>
+        <w:t>composer install</w:t>
+      </w:r>
+    </w:p>
+    <w:p>
+      <w:pPr>
+        <w:pStyle w:val="Ttulo2"/>
+        <w:divId w:val="1408185825"/>
+        <w:rPr>
+          <w:rFonts w:ascii="Segoe UI" w:eastAsia="Times New Roman" w:hAnsi="Segoe UI" w:cs="Segoe UI"/>
+        </w:rPr>
+      </w:pPr>
+      <w:r>
+        <w:rPr>
+          <w:rFonts w:ascii="Segoe UI" w:eastAsia="Times New Roman" w:hAnsi="Segoe UI" w:cs="Segoe UI"/>
+        </w:rPr>
+        <w:t>3. Creación de la Base de Datos (Desde Cero)</w:t>
+      </w:r>
+    </w:p>
+    <w:p>
+      <w:pPr>
+        <w:pStyle w:val="NormalWeb"/>
+        <w:divId w:val="1408185825"/>
+        <w:rPr>
+          <w:rFonts w:ascii="Segoe UI" w:hAnsi="Segoe UI" w:cs="Segoe UI"/>
+          <w:color w:val="333333"/>
+        </w:rPr>
+      </w:pPr>
+      <w:r>
+        <w:rPr>
+          <w:rFonts w:ascii="Segoe UI" w:hAnsi="Segoe UI" w:cs="Segoe UI"/>
+          <w:color w:val="333333"/>
+        </w:rPr>
+        <w:t xml:space="preserve">El sistema requiere una base de datos vacía para poder estructurarse. No es necesario importar ningún archivo </w:t>
+      </w:r>
+      <w:r>
+        <w:rPr>
+          <w:rStyle w:val="CdigoHTML"/>
+        </w:rPr>
+        <w:t>.sql</w:t>
+      </w:r>
+      <w:r>
+        <w:rPr>
+          <w:rFonts w:ascii="Segoe UI" w:hAnsi="Segoe UI" w:cs="Segoe UI"/>
+          <w:color w:val="333333"/>
+        </w:rPr>
+        <w:t xml:space="preserve"> manualmente, el framework se encargará de todo si seguimos estos pasos:</w:t>
+      </w:r>
+    </w:p>
+    <w:p>
+      <w:pPr>
+        <w:numPr>
+          <w:ilvl w:val="0"/>
+          <w:numId w:val="3"/>
+        </w:numPr>
+        <w:spacing w:before="100" w:beforeAutospacing="1" w:after="120"/>
+        <w:divId w:val="1408185825"/>
+        <w:rPr>
+          <w:rFonts w:ascii="Segoe UI" w:eastAsia="Times New Roman" w:hAnsi="Segoe UI" w:cs="Segoe UI"/>
+          <w:color w:val="333333"/>
+        </w:rPr>
+      </w:pPr>
+      <w:r>
+        <w:rPr>
+          <w:rFonts w:ascii="Segoe UI" w:eastAsia="Times New Roman" w:hAnsi="Segoe UI" w:cs="Segoe UI"/>
+          <w:color w:val="333333"/>
+        </w:rPr>
+        <w:t xml:space="preserve">Abra el Panel de Control de XAMPP y presione </w:t>
+      </w:r>
       <w:r>
         <w:rPr>
           <w:rStyle w:val="Fuerte"/>
-          <w:rFonts w:ascii="Arial" w:eastAsia="Times New Roman" w:hAnsi="Arial" w:cs="Arial"/>
-        </w:rPr>
-        <w:t>Herramientas:</w:t>
-      </w:r>
-      <w:r>
-        <w:rPr>
-          <w:rFonts w:ascii="Arial" w:eastAsia="Times New Roman" w:hAnsi="Arial" w:cs="Arial"/>
-        </w:rPr>
-        <w:t xml:space="preserve"> Composer.</w:t>
+          <w:rFonts w:ascii="Segoe UI" w:eastAsia="Times New Roman" w:hAnsi="Segoe UI" w:cs="Segoe UI"/>
+          <w:color w:val="333333"/>
+        </w:rPr>
+        <w:t>Start</w:t>
+      </w:r>
+      <w:r>
+        <w:rPr>
+          <w:rFonts w:ascii="Segoe UI" w:eastAsia="Times New Roman" w:hAnsi="Segoe UI" w:cs="Segoe UI"/>
+          <w:color w:val="333333"/>
+        </w:rPr>
+        <w:t xml:space="preserve"> en los módulos </w:t>
+      </w:r>
+      <w:r>
+        <w:rPr>
+          <w:rStyle w:val="Fuerte"/>
+          <w:rFonts w:ascii="Segoe UI" w:eastAsia="Times New Roman" w:hAnsi="Segoe UI" w:cs="Segoe UI"/>
+          <w:color w:val="333333"/>
+        </w:rPr>
+        <w:t>Apache</w:t>
+      </w:r>
+      <w:r>
+        <w:rPr>
+          <w:rFonts w:ascii="Segoe UI" w:eastAsia="Times New Roman" w:hAnsi="Segoe UI" w:cs="Segoe UI"/>
+          <w:color w:val="333333"/>
+        </w:rPr>
+        <w:t xml:space="preserve"> y </w:t>
+      </w:r>
+      <w:r>
+        <w:rPr>
+          <w:rStyle w:val="Fuerte"/>
+          <w:rFonts w:ascii="Segoe UI" w:eastAsia="Times New Roman" w:hAnsi="Segoe UI" w:cs="Segoe UI"/>
+          <w:color w:val="333333"/>
+        </w:rPr>
+        <w:t>MySQL</w:t>
+      </w:r>
+      <w:r>
+        <w:rPr>
+          <w:rFonts w:ascii="Segoe UI" w:eastAsia="Times New Roman" w:hAnsi="Segoe UI" w:cs="Segoe UI"/>
+          <w:color w:val="333333"/>
+        </w:rPr>
+        <w:t>.</w:t>
+      </w:r>
+    </w:p>
+    <w:p>
+      <w:pPr>
+        <w:numPr>
+          <w:ilvl w:val="0"/>
+          <w:numId w:val="3"/>
+        </w:numPr>
+        <w:spacing w:before="100" w:beforeAutospacing="1" w:after="120"/>
+        <w:divId w:val="1408185825"/>
+        <w:rPr>
+          <w:rFonts w:ascii="Segoe UI" w:eastAsia="Times New Roman" w:hAnsi="Segoe UI" w:cs="Segoe UI"/>
+          <w:color w:val="333333"/>
+        </w:rPr>
+      </w:pPr>
+      <w:r>
+        <w:rPr>
+          <w:rFonts w:ascii="Segoe UI" w:eastAsia="Times New Roman" w:hAnsi="Segoe UI" w:cs="Segoe UI"/>
+          <w:color w:val="333333"/>
+        </w:rPr>
+        <w:t xml:space="preserve">Abra su navegador web y diríjase a: </w:t>
+      </w:r>
+      <w:r>
+        <w:rPr>
+          <w:rStyle w:val="CdigoHTML"/>
+        </w:rPr>
+        <w:t>http://localhost/phpmyadmin</w:t>
+      </w:r>
+    </w:p>
+    <w:p>
+      <w:pPr>
+        <w:numPr>
+          <w:ilvl w:val="0"/>
+          <w:numId w:val="3"/>
+        </w:numPr>
+        <w:spacing w:before="100" w:beforeAutospacing="1" w:after="120"/>
+        <w:divId w:val="1408185825"/>
+        <w:rPr>
+          <w:rFonts w:ascii="Segoe UI" w:eastAsia="Times New Roman" w:hAnsi="Segoe UI" w:cs="Segoe UI"/>
+          <w:color w:val="333333"/>
+        </w:rPr>
+      </w:pPr>
+      <w:r>
+        <w:rPr>
+          <w:rFonts w:ascii="Segoe UI" w:eastAsia="Times New Roman" w:hAnsi="Segoe UI" w:cs="Segoe UI"/>
+          <w:color w:val="333333"/>
+        </w:rPr>
+        <w:t xml:space="preserve">En el menú lateral izquierdo, haga clic en </w:t>
+      </w:r>
+      <w:r>
+        <w:rPr>
+          <w:rStyle w:val="Fuerte"/>
+          <w:rFonts w:ascii="Segoe UI" w:eastAsia="Times New Roman" w:hAnsi="Segoe UI" w:cs="Segoe UI"/>
+          <w:color w:val="333333"/>
+        </w:rPr>
+        <w:t>Nueva</w:t>
+      </w:r>
+      <w:r>
+        <w:rPr>
+          <w:rFonts w:ascii="Segoe UI" w:eastAsia="Times New Roman" w:hAnsi="Segoe UI" w:cs="Segoe UI"/>
+          <w:color w:val="333333"/>
+        </w:rPr>
+        <w:t>.</w:t>
+      </w:r>
+    </w:p>
+    <w:p>
+      <w:pPr>
+        <w:numPr>
+          <w:ilvl w:val="0"/>
+          <w:numId w:val="3"/>
+        </w:numPr>
+        <w:spacing w:before="100" w:beforeAutospacing="1" w:after="120"/>
+        <w:divId w:val="1408185825"/>
+        <w:rPr>
+          <w:rFonts w:ascii="Segoe UI" w:eastAsia="Times New Roman" w:hAnsi="Segoe UI" w:cs="Segoe UI"/>
+          <w:color w:val="333333"/>
+        </w:rPr>
+      </w:pPr>
+      <w:r>
+        <w:rPr>
+          <w:rFonts w:ascii="Segoe UI" w:eastAsia="Times New Roman" w:hAnsi="Segoe UI" w:cs="Segoe UI"/>
+          <w:color w:val="333333"/>
+        </w:rPr>
+        <w:t xml:space="preserve">En "Nombre de la base de datos" escriba exactamente: </w:t>
+      </w:r>
+      <w:r>
+        <w:rPr>
+          <w:rStyle w:val="CdigoHTML"/>
+        </w:rPr>
+        <w:t>unimaq_crm_db</w:t>
+      </w:r>
+    </w:p>
+    <w:p>
+      <w:pPr>
+        <w:numPr>
+          <w:ilvl w:val="0"/>
+          <w:numId w:val="3"/>
+        </w:numPr>
+        <w:spacing w:before="100" w:beforeAutospacing="1" w:after="120"/>
+        <w:divId w:val="1408185825"/>
+        <w:rPr>
+          <w:rFonts w:ascii="Segoe UI" w:eastAsia="Times New Roman" w:hAnsi="Segoe UI" w:cs="Segoe UI"/>
+          <w:color w:val="333333"/>
+        </w:rPr>
+      </w:pPr>
+      <w:r>
+        <w:rPr>
+          <w:rFonts w:ascii="Segoe UI" w:eastAsia="Times New Roman" w:hAnsi="Segoe UI" w:cs="Segoe UI"/>
+          <w:color w:val="333333"/>
+        </w:rPr>
+        <w:t xml:space="preserve">En el menú desplegable de cotejamiento, seleccione </w:t>
+      </w:r>
+      <w:r>
+        <w:rPr>
+          <w:rStyle w:val="CdigoHTML"/>
+        </w:rPr>
+        <w:t>utf8mb4_unicode_ci</w:t>
+      </w:r>
+      <w:r>
+        <w:rPr>
+          <w:rFonts w:ascii="Segoe UI" w:eastAsia="Times New Roman" w:hAnsi="Segoe UI" w:cs="Segoe UI"/>
+          <w:color w:val="333333"/>
+        </w:rPr>
+        <w:t xml:space="preserve"> </w:t>
+      </w:r>
+      <w:r>
+        <w:rPr>
+          <w:rFonts w:ascii="Segoe UI" w:eastAsia="Times New Roman" w:hAnsi="Segoe UI" w:cs="Segoe UI"/>
+          <w:color w:val="333333"/>
+        </w:rPr>
+        <w:t>(esto asegura que caracteres como la "ñ" y tildes se guarden correctamente).</w:t>
+      </w:r>
+    </w:p>
+    <w:p>
+      <w:pPr>
+        <w:numPr>
+          <w:ilvl w:val="0"/>
+          <w:numId w:val="3"/>
+        </w:numPr>
+        <w:spacing w:before="100" w:beforeAutospacing="1" w:after="120"/>
+        <w:divId w:val="1408185825"/>
+        <w:rPr>
+          <w:rFonts w:ascii="Segoe UI" w:eastAsia="Times New Roman" w:hAnsi="Segoe UI" w:cs="Segoe UI"/>
+          <w:color w:val="333333"/>
+        </w:rPr>
+      </w:pPr>
+      <w:r>
+        <w:rPr>
+          <w:rFonts w:ascii="Segoe UI" w:eastAsia="Times New Roman" w:hAnsi="Segoe UI" w:cs="Segoe UI"/>
+          <w:color w:val="333333"/>
+        </w:rPr>
+        <w:t xml:space="preserve">Haga clic en el botón </w:t>
+      </w:r>
+      <w:r>
+        <w:rPr>
+          <w:rStyle w:val="Fuerte"/>
+          <w:rFonts w:ascii="Segoe UI" w:eastAsia="Times New Roman" w:hAnsi="Segoe UI" w:cs="Segoe UI"/>
+          <w:color w:val="333333"/>
+        </w:rPr>
+        <w:t>Crear</w:t>
+      </w:r>
+      <w:r>
+        <w:rPr>
+          <w:rFonts w:ascii="Segoe UI" w:eastAsia="Times New Roman" w:hAnsi="Segoe UI" w:cs="Segoe UI"/>
+          <w:color w:val="333333"/>
+        </w:rPr>
+        <w:t>. Deje esta base de datos completamente vacía.</w:t>
+      </w:r>
+    </w:p>
+    <w:p>
+      <w:pPr>
+        <w:pStyle w:val="Ttulo2"/>
+        <w:divId w:val="1408185825"/>
+        <w:rPr>
+          <w:rFonts w:ascii="Segoe UI" w:eastAsia="Times New Roman" w:hAnsi="Segoe UI" w:cs="Segoe UI"/>
+        </w:rPr>
+      </w:pPr>
+      <w:r>
+        <w:rPr>
+          <w:rFonts w:ascii="Segoe UI" w:eastAsia="Times New Roman" w:hAnsi="Segoe UI" w:cs="Segoe UI"/>
+        </w:rPr>
+        <w:t>4. Configuración del Entorno (.env)</w:t>
+      </w:r>
+    </w:p>
+    <w:p>
+      <w:pPr>
+        <w:numPr>
+          <w:ilvl w:val="0"/>
+          <w:numId w:val="4"/>
+        </w:numPr>
+        <w:spacing w:before="100" w:beforeAutospacing="1" w:after="120"/>
+        <w:divId w:val="1408185825"/>
+        <w:rPr>
+          <w:rFonts w:ascii="Segoe UI" w:eastAsia="Times New Roman" w:hAnsi="Segoe UI" w:cs="Segoe UI"/>
+          <w:color w:val="333333"/>
+        </w:rPr>
+      </w:pPr>
+      <w:r>
+        <w:rPr>
+          <w:rFonts w:ascii="Segoe UI" w:eastAsia="Times New Roman" w:hAnsi="Segoe UI" w:cs="Segoe UI"/>
+          <w:color w:val="333333"/>
+        </w:rPr>
+        <w:t xml:space="preserve">Dentro de la carpeta del proyecto </w:t>
+      </w:r>
+      <w:r>
+        <w:rPr>
+          <w:rStyle w:val="CdigoHTML"/>
+        </w:rPr>
+        <w:t>unimaq-crm</w:t>
+      </w:r>
+      <w:r>
+        <w:rPr>
+          <w:rFonts w:ascii="Segoe UI" w:eastAsia="Times New Roman" w:hAnsi="Segoe UI" w:cs="Segoe UI"/>
+          <w:color w:val="333333"/>
+        </w:rPr>
+        <w:t xml:space="preserve">, busque un archivo llamado </w:t>
+      </w:r>
+      <w:r>
+        <w:rPr>
+          <w:rStyle w:val="CdigoHTML"/>
+        </w:rPr>
+        <w:t>.env.example</w:t>
+      </w:r>
+      <w:r>
+        <w:rPr>
+          <w:rFonts w:ascii="Segoe UI" w:eastAsia="Times New Roman" w:hAnsi="Segoe UI" w:cs="Segoe UI"/>
+          <w:color w:val="333333"/>
+        </w:rPr>
+        <w:t>.</w:t>
+      </w:r>
+    </w:p>
+    <w:p>
+      <w:pPr>
+        <w:numPr>
+          <w:ilvl w:val="0"/>
+          <w:numId w:val="4"/>
+        </w:numPr>
+        <w:spacing w:before="100" w:beforeAutospacing="1" w:after="120"/>
+        <w:divId w:val="1408185825"/>
+        <w:rPr>
+          <w:rFonts w:ascii="Segoe UI" w:eastAsia="Times New Roman" w:hAnsi="Segoe UI" w:cs="Segoe UI"/>
+          <w:color w:val="333333"/>
+        </w:rPr>
+      </w:pPr>
+      <w:r>
+        <w:rPr>
+          <w:rFonts w:ascii="Segoe UI" w:eastAsia="Times New Roman" w:hAnsi="Segoe UI" w:cs="Segoe UI"/>
+          <w:color w:val="333333"/>
+        </w:rPr>
+        <w:t xml:space="preserve">Haga una copia de ese archivo y cambie el nombre de la copia a simplemente </w:t>
+      </w:r>
+      <w:r>
+        <w:rPr>
+          <w:rStyle w:val="CdigoHTML"/>
+        </w:rPr>
+        <w:t>.env</w:t>
+      </w:r>
+      <w:r>
+        <w:rPr>
+          <w:rFonts w:ascii="Segoe UI" w:eastAsia="Times New Roman" w:hAnsi="Segoe UI" w:cs="Segoe UI"/>
+          <w:color w:val="333333"/>
+        </w:rPr>
+        <w:t xml:space="preserve"> (asegúrese de que tenga el punto inicial).</w:t>
+      </w:r>
+    </w:p>
+    <w:p>
+      <w:pPr>
+        <w:numPr>
+          <w:ilvl w:val="0"/>
+          <w:numId w:val="4"/>
+        </w:numPr>
+        <w:spacing w:before="100" w:beforeAutospacing="1" w:after="120"/>
+        <w:divId w:val="1408185825"/>
+        <w:rPr>
+          <w:rFonts w:ascii="Segoe UI" w:eastAsia="Times New Roman" w:hAnsi="Segoe UI" w:cs="Segoe UI"/>
+          <w:color w:val="333333"/>
+        </w:rPr>
+      </w:pPr>
+      <w:r>
+        <w:rPr>
+          <w:rFonts w:ascii="Segoe UI" w:eastAsia="Times New Roman" w:hAnsi="Segoe UI" w:cs="Segoe UI"/>
+          <w:color w:val="333333"/>
+        </w:rPr>
+        <w:t xml:space="preserve">Abra el archivo </w:t>
+      </w:r>
+      <w:r>
+        <w:rPr>
+          <w:rStyle w:val="CdigoHTML"/>
+        </w:rPr>
+        <w:t>.env</w:t>
+      </w:r>
+      <w:r>
+        <w:rPr>
+          <w:rFonts w:ascii="Segoe UI" w:eastAsia="Times New Roman" w:hAnsi="Segoe UI" w:cs="Segoe UI"/>
+          <w:color w:val="333333"/>
+        </w:rPr>
+        <w:t xml:space="preserve"> </w:t>
+      </w:r>
+      <w:r>
+        <w:rPr>
+          <w:rFonts w:ascii="Segoe UI" w:eastAsia="Times New Roman" w:hAnsi="Segoe UI" w:cs="Segoe UI"/>
+          <w:color w:val="333333"/>
+        </w:rPr>
+        <w:t xml:space="preserve">con cualquier editor de texto (como el Bloc de notas o VSCode) y busque la sección de base de datos. Configúrela de la siguiente manera para conectarse a la base de datos recién creada: </w:t>
+      </w:r>
+    </w:p>
+    <w:p>
+      <w:pPr>
+        <w:pStyle w:val="HTMLconformatoprevio"/>
+        <w:numPr>
+          <w:ilvl w:val="0"/>
+          <w:numId w:val="4"/>
+        </w:numPr>
+        <w:tabs>
+          <w:tab w:val="clear" w:pos="720"/>
+        </w:tabs>
+        <w:divId w:val="1408185825"/>
+        <w:rPr>
+          <w:rStyle w:val="CdigoHTML"/>
+        </w:rPr>
+      </w:pPr>
+      <w:r>
+        <w:rPr>
+          <w:rStyle w:val="CdigoHTML"/>
+        </w:rPr>
+        <w:t>DB_CONNECTION=mysql</w:t>
+      </w:r>
+    </w:p>
+    <w:p>
+      <w:pPr>
+        <w:pStyle w:val="HTMLconformatoprevio"/>
+        <w:numPr>
+          <w:ilvl w:val="0"/>
+          <w:numId w:val="4"/>
+        </w:numPr>
+        <w:tabs>
+          <w:tab w:val="clear" w:pos="720"/>
+        </w:tabs>
+        <w:divId w:val="1408185825"/>
+        <w:rPr>
+          <w:rStyle w:val="CdigoHTML"/>
+        </w:rPr>
+      </w:pPr>
+      <w:r>
+        <w:rPr>
+          <w:rStyle w:val="CdigoHTML"/>
+        </w:rPr>
+        <w:t>DB_HOST=127.0.0.1</w:t>
+      </w:r>
+    </w:p>
+    <w:p>
+      <w:pPr>
+        <w:pStyle w:val="HTMLconformatoprevio"/>
+        <w:numPr>
+          <w:ilvl w:val="0"/>
+          <w:numId w:val="4"/>
+        </w:numPr>
+        <w:tabs>
+          <w:tab w:val="clear" w:pos="720"/>
+        </w:tabs>
+        <w:divId w:val="1408185825"/>
+        <w:rPr>
+          <w:rStyle w:val="CdigoHTML"/>
+        </w:rPr>
+      </w:pPr>
+      <w:r>
+        <w:rPr>
+          <w:rStyle w:val="CdigoHTML"/>
+        </w:rPr>
+        <w:t>DB_PORT=3306</w:t>
+      </w:r>
+    </w:p>
+    <w:p>
+      <w:pPr>
+        <w:pStyle w:val="HTMLconformatoprevio"/>
+        <w:numPr>
+          <w:ilvl w:val="0"/>
+          <w:numId w:val="4"/>
+        </w:numPr>
+        <w:tabs>
+          <w:tab w:val="clear" w:pos="720"/>
+        </w:tabs>
+        <w:divId w:val="1408185825"/>
+        <w:rPr>
+          <w:rStyle w:val="CdigoHTML"/>
+        </w:rPr>
+      </w:pPr>
+      <w:r>
+        <w:rPr>
+          <w:rStyle w:val="CdigoHTML"/>
+        </w:rPr>
+        <w:lastRenderedPageBreak/>
+        <w:t>DB_DATABASE=unimaq_crm_db</w:t>
+      </w:r>
+    </w:p>
+    <w:p>
+      <w:pPr>
+        <w:pStyle w:val="HTMLconformatoprevio"/>
+        <w:numPr>
+          <w:ilvl w:val="0"/>
+          <w:numId w:val="4"/>
+        </w:numPr>
+        <w:tabs>
+          <w:tab w:val="clear" w:pos="720"/>
+        </w:tabs>
+        <w:divId w:val="1408185825"/>
+        <w:rPr>
+          <w:rStyle w:val="CdigoHTML"/>
+        </w:rPr>
+      </w:pPr>
+      <w:r>
+        <w:rPr>
+          <w:rStyle w:val="CdigoHTML"/>
+        </w:rPr>
+        <w:t>DB_USERNAME=root</w:t>
+      </w:r>
+    </w:p>
+    <w:p>
+      <w:pPr>
+        <w:pStyle w:val="HTMLconformatoprevio"/>
+        <w:ind w:left="720"/>
+        <w:divId w:val="1408185825"/>
+        <w:rPr>
+          <w:color w:val="333333"/>
+        </w:rPr>
+      </w:pPr>
+      <w:r>
+        <w:rPr>
+          <w:rStyle w:val="CdigoHTML"/>
+        </w:rPr>
+        <w:t>DB_PASSWORD=</w:t>
+      </w:r>
+    </w:p>
+    <w:p>
+      <w:pPr>
+        <w:spacing w:beforeAutospacing="1"/>
+        <w:ind w:left="720"/>
+        <w:divId w:val="1408185825"/>
+        <w:rPr>
+          <w:rFonts w:ascii="Segoe UI" w:eastAsia="Times New Roman" w:hAnsi="Segoe UI" w:cs="Segoe UI"/>
+          <w:color w:val="333333"/>
+        </w:rPr>
+      </w:pPr>
+      <w:r>
+        <w:rPr>
+          <w:rFonts w:ascii="Segoe UI" w:eastAsia="Times New Roman" w:hAnsi="Segoe UI" w:cs="Segoe UI"/>
+          <w:i/>
+          <w:iCs/>
+          <w:color w:val="333333"/>
+        </w:rPr>
+        <w:t>Nota: En XAMPP, el usuario por defecto es "root" y la contraseña se deja en blanco.</w:t>
+      </w:r>
+      <w:r>
+        <w:rPr>
+          <w:rFonts w:ascii="Segoe UI" w:eastAsia="Times New Roman" w:hAnsi="Segoe UI" w:cs="Segoe UI"/>
+          <w:color w:val="333333"/>
+        </w:rPr>
+        <w:t xml:space="preserve"> </w:t>
+      </w:r>
+    </w:p>
+    <w:p>
+      <w:pPr>
+        <w:numPr>
+          <w:ilvl w:val="0"/>
+          <w:numId w:val="4"/>
+        </w:numPr>
+        <w:spacing w:before="100" w:beforeAutospacing="1" w:after="120"/>
+        <w:divId w:val="1408185825"/>
+        <w:rPr>
+          <w:rFonts w:ascii="Segoe UI" w:eastAsia="Times New Roman" w:hAnsi="Segoe UI" w:cs="Segoe UI"/>
+          <w:color w:val="333333"/>
+        </w:rPr>
+      </w:pPr>
+      <w:r>
+        <w:rPr>
+          <w:rFonts w:ascii="Segoe UI" w:eastAsia="Times New Roman" w:hAnsi="Segoe UI" w:cs="Segoe UI"/>
+          <w:color w:val="333333"/>
+        </w:rPr>
+        <w:t xml:space="preserve">Regrese a su consola y ejecute el comando para generar la clave de seguridad de la aplicación: </w:t>
+      </w:r>
+    </w:p>
+    <w:p>
+      <w:pPr>
+        <w:pStyle w:val="HTMLconformatoprevio"/>
+        <w:ind w:left="720"/>
+        <w:divId w:val="1408185825"/>
+        <w:rPr>
+          <w:color w:val="333333"/>
+        </w:rPr>
+      </w:pPr>
+      <w:r>
+        <w:rPr>
+          <w:rStyle w:val="CdigoHTML"/>
+        </w:rPr>
+        <w:t>php artisan key:generate</w:t>
+      </w:r>
+    </w:p>
+    <w:p>
+      <w:pPr>
+        <w:pStyle w:val="Ttulo2"/>
+        <w:divId w:val="1408185825"/>
+        <w:rPr>
+          <w:rFonts w:ascii="Segoe UI" w:eastAsia="Times New Roman" w:hAnsi="Segoe UI" w:cs="Segoe UI"/>
+        </w:rPr>
+      </w:pPr>
+      <w:r>
+        <w:rPr>
+          <w:rFonts w:ascii="Segoe UI" w:eastAsia="Times New Roman" w:hAnsi="Segoe UI" w:cs="Segoe UI"/>
+        </w:rPr>
+        <w:t>5. Inyección de Datos Estructurales (Migraciones)</w:t>
       </w:r>
     </w:p>
     <w:p>
       <w:pPr>
         <w:pStyle w:val="NormalWeb"/>
-        <w:rPr>
-          <w:rFonts w:ascii="Arial" w:hAnsi="Arial" w:cs="Arial"/>
+        <w:divId w:val="1408185825"/>
+        <w:rPr>
+          <w:rFonts w:ascii="Segoe UI" w:hAnsi="Segoe UI" w:cs="Segoe UI"/>
+          <w:color w:val="333333"/>
+        </w:rPr>
+      </w:pPr>
+      <w:r>
+        <w:rPr>
+          <w:rFonts w:ascii="Segoe UI" w:hAnsi="Segoe UI" w:cs="Segoe UI"/>
+          <w:color w:val="333333"/>
+        </w:rPr>
+        <w:t>Como mencionamos, no utilizamos archivos SQL tradicionales. En su consola (dentro de la carpeta del proyecto), ejecute este comando maestro:</w:t>
+      </w:r>
+    </w:p>
+    <w:p>
+      <w:pPr>
+        <w:pStyle w:val="HTMLconformatoprevio"/>
+        <w:divId w:val="1408185825"/>
+        <w:rPr>
+          <w:color w:val="333333"/>
+        </w:rPr>
+      </w:pPr>
+      <w:r>
+        <w:rPr>
+          <w:rStyle w:val="CdigoHTML"/>
+        </w:rPr>
+        <w:t>php artisan migrate --seed</w:t>
+      </w:r>
+    </w:p>
+    <w:p>
+      <w:pPr>
+        <w:pStyle w:val="NormalWeb"/>
+        <w:divId w:val="1408185825"/>
+        <w:rPr>
+          <w:rFonts w:ascii="Segoe UI" w:hAnsi="Segoe UI" w:cs="Segoe UI"/>
+          <w:color w:val="333333"/>
         </w:rPr>
       </w:pPr>
       <w:r>
         <w:rPr>
           <w:rStyle w:val="Fuerte"/>
-          <w:rFonts w:ascii="Arial" w:hAnsi="Arial" w:cs="Arial"/>
-        </w:rPr>
-        <w:t>Aviso Importante:</w:t>
-      </w:r>
-      <w:r>
-        <w:rPr>
-          <w:rFonts w:ascii="Arial" w:hAnsi="Arial" w:cs="Arial"/>
-        </w:rPr>
-        <w:t xml:space="preserve"> Debe verificar en su archivo </w:t>
-      </w:r>
-      <w:r>
-        <w:rPr>
-          <w:rStyle w:val="CdigoHTML"/>
-        </w:rPr>
-        <w:t>php.ini</w:t>
-      </w:r>
-      <w:r>
-        <w:rPr>
-          <w:rFonts w:ascii="Arial" w:hAnsi="Arial" w:cs="Arial"/>
-        </w:rPr>
-        <w:t xml:space="preserve"> que las líneas </w:t>
-      </w:r>
-      <w:r>
-        <w:rPr>
-          <w:rStyle w:val="CdigoHTML"/>
-        </w:rPr>
-        <w:t>extension=gd</w:t>
-      </w:r>
-      <w:r>
-        <w:rPr>
-          <w:rFonts w:ascii="Arial" w:hAnsi="Arial" w:cs="Arial"/>
-        </w:rPr>
-        <w:t xml:space="preserve"> y </w:t>
-      </w:r>
-      <w:r>
-        <w:rPr>
-          <w:rStyle w:val="CdigoHTML"/>
-        </w:rPr>
-        <w:t>extension=zip</w:t>
-      </w:r>
-      <w:r>
-        <w:rPr>
-          <w:rFonts w:ascii="Arial" w:hAnsi="Arial" w:cs="Arial"/>
-        </w:rPr>
-        <w:t xml:space="preserve"> estén activas.</w:t>
+          <w:rFonts w:ascii="Segoe UI" w:hAnsi="Segoe UI" w:cs="Segoe UI"/>
+          <w:color w:val="333333"/>
+        </w:rPr>
+        <w:t>¿Qué hace este comando automáticamente?</w:t>
+      </w:r>
+    </w:p>
+    <w:p>
+      <w:pPr>
+        <w:numPr>
+          <w:ilvl w:val="0"/>
+          <w:numId w:val="5"/>
+        </w:numPr>
+        <w:spacing w:before="100" w:beforeAutospacing="1" w:after="120"/>
+        <w:divId w:val="1408185825"/>
+        <w:rPr>
+          <w:rFonts w:ascii="Segoe UI" w:eastAsia="Times New Roman" w:hAnsi="Segoe UI" w:cs="Segoe UI"/>
+          <w:color w:val="333333"/>
+        </w:rPr>
+      </w:pPr>
+      <w:r>
+        <w:rPr>
+          <w:rFonts w:ascii="Segoe UI" w:eastAsia="Times New Roman" w:hAnsi="Segoe UI" w:cs="Segoe UI"/>
+          <w:color w:val="333333"/>
+        </w:rPr>
+        <w:t>Crea todas las tablas necesarias en la base de datos (usuarios, clientes, ventas, cotizaciones, etc.) con sus respectivas relaciones y claves foráneas.</w:t>
+      </w:r>
+    </w:p>
+    <w:p>
+      <w:pPr>
+        <w:numPr>
+          <w:ilvl w:val="0"/>
+          <w:numId w:val="5"/>
+        </w:numPr>
+        <w:spacing w:before="100" w:beforeAutospacing="1" w:after="120"/>
+        <w:divId w:val="1408185825"/>
+        <w:rPr>
+          <w:rFonts w:ascii="Segoe UI" w:eastAsia="Times New Roman" w:hAnsi="Segoe UI" w:cs="Segoe UI"/>
+          <w:color w:val="333333"/>
+        </w:rPr>
+      </w:pPr>
+      <w:r>
+        <w:rPr>
+          <w:rFonts w:ascii="Segoe UI" w:eastAsia="Times New Roman" w:hAnsi="Segoe UI" w:cs="Segoe UI"/>
+          <w:color w:val="333333"/>
+        </w:rPr>
+        <w:t xml:space="preserve">El atributo </w:t>
+      </w:r>
+      <w:r>
+        <w:rPr>
+          <w:rStyle w:val="CdigoHTML"/>
+        </w:rPr>
+        <w:t>--seed</w:t>
+      </w:r>
+      <w:r>
+        <w:rPr>
+          <w:rFonts w:ascii="Segoe UI" w:eastAsia="Times New Roman" w:hAnsi="Segoe UI" w:cs="Segoe UI"/>
+          <w:color w:val="333333"/>
+        </w:rPr>
+        <w:t xml:space="preserve"> ejecuta los inyectores de datos (Seeders). Esto poblará la tabla de Roles (Administrador, Vendedor) y creará la cuenta principal de acceso para que usted pueda ingresar.</w:t>
+      </w:r>
+    </w:p>
+    <w:p>
+      <w:pPr>
+        <w:shd w:val="clear" w:color="auto" w:fill="FFF3CD"/>
+        <w:divId w:val="664624183"/>
+        <w:rPr>
+          <w:rFonts w:ascii="Segoe UI" w:eastAsia="Times New Roman" w:hAnsi="Segoe UI" w:cs="Segoe UI"/>
+          <w:color w:val="856404"/>
+        </w:rPr>
+      </w:pPr>
+      <w:r>
+        <w:rPr>
+          <w:rStyle w:val="Fuerte"/>
+          <w:rFonts w:ascii="Segoe UI" w:eastAsia="Times New Roman" w:hAnsi="Segoe UI" w:cs="Segoe UI"/>
+          <w:color w:val="856404"/>
+        </w:rPr>
+        <w:t>Credenciales Generadas Automáticamente:</w:t>
+      </w:r>
+      <w:r>
+        <w:rPr>
+          <w:rFonts w:ascii="Segoe UI" w:eastAsia="Times New Roman" w:hAnsi="Segoe UI" w:cs="Segoe UI"/>
+          <w:color w:val="856404"/>
+        </w:rPr>
+        <w:br/>
+        <w:t xml:space="preserve">Correo: </w:t>
+      </w:r>
+      <w:r>
+        <w:rPr>
+          <w:rStyle w:val="CdigoHTML"/>
+        </w:rPr>
+        <w:t>admin@unimaq.pe</w:t>
+      </w:r>
+      <w:r>
+        <w:rPr>
+          <w:rFonts w:ascii="Segoe UI" w:eastAsia="Times New Roman" w:hAnsi="Segoe UI" w:cs="Segoe UI"/>
+          <w:color w:val="856404"/>
+        </w:rPr>
+        <w:br/>
+        <w:t xml:space="preserve">Contraseña: </w:t>
+      </w:r>
+      <w:r>
+        <w:rPr>
+          <w:rStyle w:val="CdigoHTML"/>
+        </w:rPr>
+        <w:t>password</w:t>
+      </w:r>
+      <w:r>
+        <w:rPr>
+          <w:rFonts w:ascii="Segoe UI" w:eastAsia="Times New Roman" w:hAnsi="Segoe UI" w:cs="Segoe UI"/>
+          <w:color w:val="856404"/>
+        </w:rPr>
+        <w:t xml:space="preserve"> </w:t>
       </w:r>
     </w:p>
     <w:p>
       <w:pPr>
         <w:pStyle w:val="Ttulo2"/>
-        <w:rPr>
-          <w:rFonts w:ascii="Arial" w:eastAsia="Times New Roman" w:hAnsi="Arial" w:cs="Arial"/>
-        </w:rPr>
-      </w:pPr>
-      <w:r>
-        <w:rPr>
-          <w:rFonts w:ascii="Arial" w:eastAsia="Times New Roman" w:hAnsi="Arial" w:cs="Arial"/>
-        </w:rPr>
-        <w:t>2. Preparación del Entorno</w:t>
+        <w:divId w:val="1408185825"/>
+        <w:rPr>
+          <w:rFonts w:ascii="Segoe UI" w:eastAsia="Times New Roman" w:hAnsi="Segoe UI" w:cs="Segoe UI"/>
+        </w:rPr>
+      </w:pPr>
+      <w:r>
+        <w:rPr>
+          <w:rFonts w:ascii="Segoe UI" w:eastAsia="Times New Roman" w:hAnsi="Segoe UI" w:cs="Segoe UI"/>
+        </w:rPr>
+        <w:t>6. Inicialización del Sistema</w:t>
       </w:r>
     </w:p>
     <w:p>
       <w:pPr>
         <w:pStyle w:val="NormalWeb"/>
-        <w:rPr>
-          <w:rFonts w:ascii="Arial" w:hAnsi="Arial" w:cs="Arial"/>
-        </w:rPr>
-      </w:pPr>
-      <w:r>
-        <w:rPr>
-          <w:rFonts w:ascii="Arial" w:hAnsi="Arial" w:cs="Arial"/>
-        </w:rPr>
-        <w:t>Copie la carpeta del proyecto a la ruta pública de su servidor local.</w:t>
+        <w:divId w:val="1408185825"/>
+        <w:rPr>
+          <w:rFonts w:ascii="Segoe UI" w:hAnsi="Segoe UI" w:cs="Segoe UI"/>
+          <w:color w:val="333333"/>
+        </w:rPr>
+      </w:pPr>
+      <w:r>
+        <w:rPr>
+          <w:rFonts w:ascii="Segoe UI" w:hAnsi="Segoe UI" w:cs="Segoe UI"/>
+          <w:color w:val="333333"/>
+        </w:rPr>
+        <w:t>Con todo configurado y la base de datos lista, solo queda encender el motor del sistema. Ejecute en la consola:</w:t>
+      </w:r>
+    </w:p>
+    <w:p>
+      <w:pPr>
+        <w:pStyle w:val="HTMLconformatoprevio"/>
+        <w:divId w:val="1408185825"/>
+        <w:rPr>
+          <w:color w:val="333333"/>
+        </w:rPr>
+      </w:pPr>
+      <w:r>
+        <w:rPr>
+          <w:rStyle w:val="CdigoHTML"/>
+        </w:rPr>
+        <w:t>php artisan serve</w:t>
       </w:r>
     </w:p>
     <w:p>
       <w:pPr>
         <w:pStyle w:val="NormalWeb"/>
-        <w:rPr>
-          <w:rFonts w:ascii="Arial" w:hAnsi="Arial" w:cs="Arial"/>
-        </w:rPr>
-      </w:pPr>
-      <w:r>
-        <w:rPr>
-          <w:rFonts w:ascii="Arial" w:hAnsi="Arial" w:cs="Arial"/>
-        </w:rPr>
-        <w:t>Instale las dependencias de PHP:</w:t>
+        <w:divId w:val="1408185825"/>
+        <w:rPr>
+          <w:rFonts w:ascii="Segoe UI" w:hAnsi="Segoe UI" w:cs="Segoe UI"/>
+          <w:color w:val="333333"/>
+        </w:rPr>
+      </w:pPr>
+      <w:r>
+        <w:rPr>
+          <w:rFonts w:ascii="Segoe UI" w:hAnsi="Segoe UI" w:cs="Segoe UI"/>
+          <w:color w:val="333333"/>
+        </w:rPr>
+        <w:t>El terminal le indicará que el servidor se ha iniciado. Abra su navegador web (Google Chrome o Firefox) y acceda a la dirección que le marca la consola, típicamente:</w:t>
       </w:r>
     </w:p>
     <w:p>
       <w:pPr>
         <w:pStyle w:val="HTMLconformatoprevio"/>
-        <w:rPr>
-          <w:rStyle w:val="CdigoHTML"/>
-        </w:rPr>
-      </w:pPr>
-      <w:r>
-        <w:rPr>
-          <w:rStyle w:val="CdigoHTML"/>
-        </w:rPr>
-        <w:t>cd C:\xampp\htdocs\unimaq-crm</w:t>
-      </w:r>
-    </w:p>
-    <w:p>
-      <w:pPr>
-        <w:pStyle w:val="HTMLconformatoprevio"/>
-      </w:pPr>
-      <w:r>
-        <w:rPr>
-          <w:rStyle w:val="CdigoHTML"/>
-        </w:rPr>
-        <w:t>composer install</w:t>
-      </w:r>
-    </w:p>
-    <w:p>
-      <w:pPr>
-        <w:pStyle w:val="Ttulo2"/>
-        <w:rPr>
-          <w:rFonts w:ascii="Arial" w:eastAsia="Times New Roman" w:hAnsi="Arial" w:cs="Arial"/>
-        </w:rPr>
-      </w:pPr>
-      <w:r>
-        <w:rPr>
-          <w:rFonts w:ascii="Arial" w:eastAsia="Times New Roman" w:hAnsi="Arial" w:cs="Arial"/>
-        </w:rPr>
-        <w:t>3. Configuración del Sistema</w:t>
+        <w:divId w:val="1408185825"/>
+        <w:rPr>
+          <w:color w:val="333333"/>
+        </w:rPr>
+      </w:pPr>
+      <w:r>
+        <w:rPr>
+          <w:rStyle w:val="CdigoHTML"/>
+        </w:rPr>
+        <w:t>http://127.0.0.1:8000</w:t>
       </w:r>
     </w:p>
     <w:p>
       <w:pPr>
         <w:pStyle w:val="NormalWeb"/>
-        <w:rPr>
-          <w:rFonts w:ascii="Arial" w:hAnsi="Arial" w:cs="Arial"/>
-        </w:rPr>
-      </w:pPr>
-      <w:r>
-        <w:rPr>
-          <w:rFonts w:ascii="Arial" w:hAnsi="Arial" w:cs="Arial"/>
-        </w:rPr>
-        <w:t xml:space="preserve">Duplique el archivo </w:t>
-      </w:r>
-      <w:r>
-        <w:rPr>
-          <w:rStyle w:val="CdigoHTML"/>
-        </w:rPr>
-        <w:t>.env.example</w:t>
-      </w:r>
-      <w:r>
-        <w:rPr>
-          <w:rFonts w:ascii="Arial" w:hAnsi="Arial" w:cs="Arial"/>
-        </w:rPr>
-        <w:t xml:space="preserve"> y renómbrelo como </w:t>
-      </w:r>
-      <w:r>
-        <w:rPr>
-          <w:rStyle w:val="CdigoHTML"/>
-        </w:rPr>
-        <w:t>.env</w:t>
-      </w:r>
-      <w:r>
-        <w:rPr>
-          <w:rFonts w:ascii="Arial" w:hAnsi="Arial" w:cs="Arial"/>
-        </w:rPr>
-        <w:t>. Configure sus credenciales de MySQL. Luego genere la clave:</w:t>
-      </w:r>
-    </w:p>
-    <w:p>
-      <w:pPr>
-        <w:pStyle w:val="HTMLconformatoprevio"/>
-      </w:pPr>
-      <w:r>
-        <w:rPr>
-          <w:rStyle w:val="CdigoHTML"/>
-        </w:rPr>
-        <w:t>php artisan key:generate</w:t>
-      </w:r>
-    </w:p>
-    <w:p>
-      <w:pPr>
-        <w:pStyle w:val="Ttulo2"/>
-        <w:rPr>
-          <w:rFonts w:ascii="Arial" w:eastAsia="Times New Roman" w:hAnsi="Arial" w:cs="Arial"/>
-        </w:rPr>
-      </w:pPr>
-      <w:r>
-        <w:rPr>
-          <w:rFonts w:ascii="Arial" w:eastAsia="Times New Roman" w:hAnsi="Arial" w:cs="Arial"/>
-        </w:rPr>
-        <w:t>4. Base de Datos</w:t>
+        <w:divId w:val="1408185825"/>
+        <w:rPr>
+          <w:rFonts w:ascii="Segoe UI" w:hAnsi="Segoe UI" w:cs="Segoe UI"/>
+          <w:color w:val="333333"/>
+        </w:rPr>
+      </w:pPr>
+      <w:r>
+        <w:rPr>
+          <w:rFonts w:ascii="Segoe UI" w:hAnsi="Segoe UI" w:cs="Segoe UI"/>
+          <w:color w:val="333333"/>
+        </w:rPr>
+        <w:t>Aparecerá la pantalla de inicio de sesión del CRM UNIMAQ. Utilice las credenciales del paso 5 para ingresar.</w:t>
       </w:r>
     </w:p>
     <w:p>
       <w:pPr>
         <w:pStyle w:val="NormalWeb"/>
-        <w:rPr>
-          <w:rFonts w:ascii="Arial" w:hAnsi="Arial" w:cs="Arial"/>
-        </w:rPr>
-      </w:pPr>
-      <w:r>
-        <w:rPr>
-          <w:rFonts w:ascii="Arial" w:hAnsi="Arial" w:cs="Arial"/>
-        </w:rPr>
-        <w:t>Ejecute las migraciones y seeders para generar las tablas y la cuenta de administrador:</w:t>
-      </w:r>
-    </w:p>
-    <w:p>
-      <w:pPr>
-        <w:pStyle w:val="HTMLconformatoprevio"/>
-      </w:pPr>
-      <w:r>
-        <w:rPr>
-          <w:rStyle w:val="CdigoHTML"/>
-        </w:rPr>
-        <w:t>php artisan migrate:fresh --seed</w:t>
-      </w:r>
-    </w:p>
-    <w:p>
-      <w:pPr>
-        <w:pStyle w:val="Ttulo2"/>
-        <w:rPr>
-          <w:rFonts w:ascii="Arial" w:eastAsia="Times New Roman" w:hAnsi="Arial" w:cs="Arial"/>
-        </w:rPr>
-      </w:pPr>
-      <w:r>
-        <w:rPr>
-          <w:rFonts w:ascii="Arial" w:eastAsia="Times New Roman" w:hAnsi="Arial" w:cs="Arial"/>
-        </w:rPr>
-        <w:t>5. Puesta en Marcha</w:t>
-      </w:r>
-    </w:p>
-    <w:p>
-      <w:pPr>
-        <w:pStyle w:val="NormalWeb"/>
-        <w:rPr>
-          <w:rFonts w:ascii="Arial" w:hAnsi="Arial" w:cs="Arial"/>
-        </w:rPr>
-      </w:pPr>
-      <w:r>
-        <w:rPr>
-          <w:rFonts w:ascii="Arial" w:hAnsi="Arial" w:cs="Arial"/>
-        </w:rPr>
-        <w:t>Ejecute el siguiente comando para iniciar el servidor de prueba:</w:t>
-      </w:r>
-    </w:p>
-    <w:p>
-      <w:pPr>
-        <w:pStyle w:val="HTMLconformatoprevio"/>
-      </w:pPr>
-      <w:r>
-        <w:rPr>
-          <w:rStyle w:val="CdigoHTML"/>
-        </w:rPr>
-        <w:lastRenderedPageBreak/>
-        <w:t>php artisan serve</w:t>
+        <w:divId w:val="1408185825"/>
+        <w:rPr>
+          <w:rFonts w:ascii="Segoe UI" w:hAnsi="Segoe UI" w:cs="Segoe UI"/>
+          <w:color w:val="333333"/>
+        </w:rPr>
+      </w:pPr>
+      <w:r>
+        <w:rPr>
+          <w:rFonts w:ascii="Segoe UI" w:hAnsi="Segoe UI" w:cs="Segoe UI"/>
+          <w:i/>
+          <w:iCs/>
+          <w:color w:val="333333"/>
+        </w:rPr>
+        <w:t>Fin de la guía de instalación.</w:t>
       </w:r>
     </w:p>
     <w:sectPr>
@@ -461,9 +1292,9 @@
 <file path=word/numbering.xml><?xml version="1.0" encoding="utf-8"?>
 <w:numbering xmlns:wpc="http://schemas.microsoft.com/office/word/2010/wordprocessingCanvas" xmlns:cx="http://schemas.microsoft.com/office/drawing/2014/chartex" xmlns:cx1="http://schemas.microsoft.com/office/drawing/2015/9/8/chartex" xmlns:cx2="http://schemas.microsoft.com/office/drawing/2015/10/21/chartex" xmlns:cx3="http://schemas.microsoft.com/office/drawing/2016/5/9/chartex" xmlns:cx4="http://schemas.microsoft.com/office/drawing/2016/5/10/chartex" xmlns:cx5="http://schemas.microsoft.com/office/drawing/2016/5/11/chartex" xmlns:cx6="http://schemas.microsoft.com/office/drawing/2016/5/12/chartex" xmlns:cx7="http://schemas.microsoft.com/office/drawing/2016/5/13/chartex" xmlns:cx8="http://schemas.microsoft.com/office/drawing/2016/5/14/chartex" xmlns:mc="http://schemas.openxmlformats.org/markup-compatibility/2006" xmlns:aink="http://schemas.microsoft.com/office/drawing/2016/ink" xmlns:am3d="http://schemas.microsoft.com/office/drawing/2017/model3d" xmlns:o="urn:schemas-microsoft-com:office:office" xmlns:oel="http://schemas.microsoft.com/office/2019/extlst" xmlns:r="http://schemas.openxmlformats.org/officeDocument/2006/relationships" xmlns:m="http://schemas.openxmlformats.org/officeDocument/2006/math" xmlns:v="urn:schemas-microsoft-com:vml" xmlns:wp14="http://schemas.microsoft.com/office/word/2010/wordprocessingDrawing" xmlns:wp="http://schemas.openxmlformats.org/drawingml/2006/wordprocessingDrawing" xmlns:w10="urn:schemas-microsoft-com:office:word" xmlns:w="http://schemas.openxmlformats.org/wordprocessingml/2006/main" xmlns:w14="http://schemas.microsoft.com/office/word/2010/wordml" xmlns:w15="http://schemas.microsoft.com/office/word/2012/wordml" xmlns:w16cex="http://schemas.microsoft.com/office/word/2018/wordml/cex" xmlns:w16cid="http://schemas.microsoft.com/office/word/2016/wordml/cid" xmlns:w16="http://schemas.microsoft.com/office/word/2018/wordml" xmlns:w16du="http://schemas.microsoft.com/office/word/2023/wordml/word16du" xmlns:w16sdtdh="http://schemas.microsoft.com/office/word/2020/wordml/sdtdatahash" xmlns:w16sdtfl="http://schemas.microsoft.com/office/word/2024/wordml/sdtformatlock" xmlns:w16se="http://schemas.microsoft.com/office/word/2015/wordml/symex" xmlns:wpg="http://schemas.microsoft.com/office/word/2010/wordprocessingGroup" xmlns:wpi="http://schemas.microsoft.com/office/word/2010/wordprocessingInk" xmlns:wne="http://schemas.microsoft.com/office/word/2006/wordml" xmlns:wps="http://schemas.microsoft.com/office/word/2010/wordprocessingShape" mc:Ignorable="w14 w15 w16se w16cid w16 w16cex w16sdtdh w16sdtfl w16du wp14">
   <w:abstractNum w:abstractNumId="0" w15:restartNumberingAfterBreak="0">
-    <w:nsid w:val="26862782"/>
+    <w:nsid w:val="210D25ED"/>
     <w:multiLevelType w:val="multilevel"/>
-    <w:tmpl w:val="F1665D72"/>
+    <w:tmpl w:val="760636F4"/>
     <w:lvl w:ilvl="0">
       <w:start w:val="1"/>
       <w:numFmt w:val="bullet"/>
@@ -609,7 +1440,507 @@
       </w:rPr>
     </w:lvl>
   </w:abstractNum>
-  <w:num w:numId="1" w16cid:durableId="592710213">
+  <w:abstractNum w:abstractNumId="1" w15:restartNumberingAfterBreak="0">
+    <w:nsid w:val="2C7E27E4"/>
+    <w:multiLevelType w:val="multilevel"/>
+    <w:tmpl w:val="1A524432"/>
+    <w:lvl w:ilvl="0">
+      <w:start w:val="1"/>
+      <w:numFmt w:val="decimal"/>
+      <w:lvlText w:val="%1."/>
+      <w:lvlJc w:val="left"/>
+      <w:pPr>
+        <w:tabs>
+          <w:tab w:val="num" w:pos="720"/>
+        </w:tabs>
+        <w:ind w:left="720" w:hanging="360"/>
+      </w:pPr>
+    </w:lvl>
+    <w:lvl w:ilvl="1" w:tentative="1">
+      <w:start w:val="1"/>
+      <w:numFmt w:val="decimal"/>
+      <w:lvlText w:val="%2."/>
+      <w:lvlJc w:val="left"/>
+      <w:pPr>
+        <w:tabs>
+          <w:tab w:val="num" w:pos="1440"/>
+        </w:tabs>
+        <w:ind w:left="1440" w:hanging="360"/>
+      </w:pPr>
+    </w:lvl>
+    <w:lvl w:ilvl="2" w:tentative="1">
+      <w:start w:val="1"/>
+      <w:numFmt w:val="decimal"/>
+      <w:lvlText w:val="%3."/>
+      <w:lvlJc w:val="left"/>
+      <w:pPr>
+        <w:tabs>
+          <w:tab w:val="num" w:pos="2160"/>
+        </w:tabs>
+        <w:ind w:left="2160" w:hanging="360"/>
+      </w:pPr>
+    </w:lvl>
+    <w:lvl w:ilvl="3" w:tentative="1">
+      <w:start w:val="1"/>
+      <w:numFmt w:val="decimal"/>
+      <w:lvlText w:val="%4."/>
+      <w:lvlJc w:val="left"/>
+      <w:pPr>
+        <w:tabs>
+          <w:tab w:val="num" w:pos="2880"/>
+        </w:tabs>
+        <w:ind w:left="2880" w:hanging="360"/>
+      </w:pPr>
+    </w:lvl>
+    <w:lvl w:ilvl="4" w:tentative="1">
+      <w:start w:val="1"/>
+      <w:numFmt w:val="decimal"/>
+      <w:lvlText w:val="%5."/>
+      <w:lvlJc w:val="left"/>
+      <w:pPr>
+        <w:tabs>
+          <w:tab w:val="num" w:pos="3600"/>
+        </w:tabs>
+        <w:ind w:left="3600" w:hanging="360"/>
+      </w:pPr>
+    </w:lvl>
+    <w:lvl w:ilvl="5" w:tentative="1">
+      <w:start w:val="1"/>
+      <w:numFmt w:val="decimal"/>
+      <w:lvlText w:val="%6."/>
+      <w:lvlJc w:val="left"/>
+      <w:pPr>
+        <w:tabs>
+          <w:tab w:val="num" w:pos="4320"/>
+        </w:tabs>
+        <w:ind w:left="4320" w:hanging="360"/>
+      </w:pPr>
+    </w:lvl>
+    <w:lvl w:ilvl="6" w:tentative="1">
+      <w:start w:val="1"/>
+      <w:numFmt w:val="decimal"/>
+      <w:lvlText w:val="%7."/>
+      <w:lvlJc w:val="left"/>
+      <w:pPr>
+        <w:tabs>
+          <w:tab w:val="num" w:pos="5040"/>
+        </w:tabs>
+        <w:ind w:left="5040" w:hanging="360"/>
+      </w:pPr>
+    </w:lvl>
+    <w:lvl w:ilvl="7" w:tentative="1">
+      <w:start w:val="1"/>
+      <w:numFmt w:val="decimal"/>
+      <w:lvlText w:val="%8."/>
+      <w:lvlJc w:val="left"/>
+      <w:pPr>
+        <w:tabs>
+          <w:tab w:val="num" w:pos="5760"/>
+        </w:tabs>
+        <w:ind w:left="5760" w:hanging="360"/>
+      </w:pPr>
+    </w:lvl>
+    <w:lvl w:ilvl="8" w:tentative="1">
+      <w:start w:val="1"/>
+      <w:numFmt w:val="decimal"/>
+      <w:lvlText w:val="%9."/>
+      <w:lvlJc w:val="left"/>
+      <w:pPr>
+        <w:tabs>
+          <w:tab w:val="num" w:pos="6480"/>
+        </w:tabs>
+        <w:ind w:left="6480" w:hanging="360"/>
+      </w:pPr>
+    </w:lvl>
+  </w:abstractNum>
+  <w:abstractNum w:abstractNumId="2" w15:restartNumberingAfterBreak="0">
+    <w:nsid w:val="4C50693B"/>
+    <w:multiLevelType w:val="multilevel"/>
+    <w:tmpl w:val="B2726E06"/>
+    <w:lvl w:ilvl="0">
+      <w:start w:val="1"/>
+      <w:numFmt w:val="decimal"/>
+      <w:lvlText w:val="%1."/>
+      <w:lvlJc w:val="left"/>
+      <w:pPr>
+        <w:tabs>
+          <w:tab w:val="num" w:pos="720"/>
+        </w:tabs>
+        <w:ind w:left="720" w:hanging="360"/>
+      </w:pPr>
+    </w:lvl>
+    <w:lvl w:ilvl="1" w:tentative="1">
+      <w:start w:val="1"/>
+      <w:numFmt w:val="decimal"/>
+      <w:lvlText w:val="%2."/>
+      <w:lvlJc w:val="left"/>
+      <w:pPr>
+        <w:tabs>
+          <w:tab w:val="num" w:pos="1440"/>
+        </w:tabs>
+        <w:ind w:left="1440" w:hanging="360"/>
+      </w:pPr>
+    </w:lvl>
+    <w:lvl w:ilvl="2" w:tentative="1">
+      <w:start w:val="1"/>
+      <w:numFmt w:val="decimal"/>
+      <w:lvlText w:val="%3."/>
+      <w:lvlJc w:val="left"/>
+      <w:pPr>
+        <w:tabs>
+          <w:tab w:val="num" w:pos="2160"/>
+        </w:tabs>
+        <w:ind w:left="2160" w:hanging="360"/>
+      </w:pPr>
+    </w:lvl>
+    <w:lvl w:ilvl="3" w:tentative="1">
+      <w:start w:val="1"/>
+      <w:numFmt w:val="decimal"/>
+      <w:lvlText w:val="%4."/>
+      <w:lvlJc w:val="left"/>
+      <w:pPr>
+        <w:tabs>
+          <w:tab w:val="num" w:pos="2880"/>
+        </w:tabs>
+        <w:ind w:left="2880" w:hanging="360"/>
+      </w:pPr>
+    </w:lvl>
+    <w:lvl w:ilvl="4" w:tentative="1">
+      <w:start w:val="1"/>
+      <w:numFmt w:val="decimal"/>
+      <w:lvlText w:val="%5."/>
+      <w:lvlJc w:val="left"/>
+      <w:pPr>
+        <w:tabs>
+          <w:tab w:val="num" w:pos="3600"/>
+        </w:tabs>
+        <w:ind w:left="3600" w:hanging="360"/>
+      </w:pPr>
+    </w:lvl>
+    <w:lvl w:ilvl="5" w:tentative="1">
+      <w:start w:val="1"/>
+      <w:numFmt w:val="decimal"/>
+      <w:lvlText w:val="%6."/>
+      <w:lvlJc w:val="left"/>
+      <w:pPr>
+        <w:tabs>
+          <w:tab w:val="num" w:pos="4320"/>
+        </w:tabs>
+        <w:ind w:left="4320" w:hanging="360"/>
+      </w:pPr>
+    </w:lvl>
+    <w:lvl w:ilvl="6" w:tentative="1">
+      <w:start w:val="1"/>
+      <w:numFmt w:val="decimal"/>
+      <w:lvlText w:val="%7."/>
+      <w:lvlJc w:val="left"/>
+      <w:pPr>
+        <w:tabs>
+          <w:tab w:val="num" w:pos="5040"/>
+        </w:tabs>
+        <w:ind w:left="5040" w:hanging="360"/>
+      </w:pPr>
+    </w:lvl>
+    <w:lvl w:ilvl="7" w:tentative="1">
+      <w:start w:val="1"/>
+      <w:numFmt w:val="decimal"/>
+      <w:lvlText w:val="%8."/>
+      <w:lvlJc w:val="left"/>
+      <w:pPr>
+        <w:tabs>
+          <w:tab w:val="num" w:pos="5760"/>
+        </w:tabs>
+        <w:ind w:left="5760" w:hanging="360"/>
+      </w:pPr>
+    </w:lvl>
+    <w:lvl w:ilvl="8" w:tentative="1">
+      <w:start w:val="1"/>
+      <w:numFmt w:val="decimal"/>
+      <w:lvlText w:val="%9."/>
+      <w:lvlJc w:val="left"/>
+      <w:pPr>
+        <w:tabs>
+          <w:tab w:val="num" w:pos="6480"/>
+        </w:tabs>
+        <w:ind w:left="6480" w:hanging="360"/>
+      </w:pPr>
+    </w:lvl>
+  </w:abstractNum>
+  <w:abstractNum w:abstractNumId="3" w15:restartNumberingAfterBreak="0">
+    <w:nsid w:val="63B3128D"/>
+    <w:multiLevelType w:val="multilevel"/>
+    <w:tmpl w:val="05225E16"/>
+    <w:lvl w:ilvl="0">
+      <w:start w:val="1"/>
+      <w:numFmt w:val="bullet"/>
+      <w:lvlText w:val=""/>
+      <w:lvlJc w:val="left"/>
+      <w:pPr>
+        <w:tabs>
+          <w:tab w:val="num" w:pos="720"/>
+        </w:tabs>
+        <w:ind w:left="720" w:hanging="360"/>
+      </w:pPr>
+      <w:rPr>
+        <w:rFonts w:ascii="Symbol" w:hAnsi="Symbol" w:hint="default"/>
+        <w:sz w:val="20"/>
+      </w:rPr>
+    </w:lvl>
+    <w:lvl w:ilvl="1" w:tentative="1">
+      <w:start w:val="1"/>
+      <w:numFmt w:val="bullet"/>
+      <w:lvlText w:val="o"/>
+      <w:lvlJc w:val="left"/>
+      <w:pPr>
+        <w:tabs>
+          <w:tab w:val="num" w:pos="1440"/>
+        </w:tabs>
+        <w:ind w:left="1440" w:hanging="360"/>
+      </w:pPr>
+      <w:rPr>
+        <w:rFonts w:ascii="Courier New" w:hAnsi="Courier New" w:hint="default"/>
+        <w:sz w:val="20"/>
+      </w:rPr>
+    </w:lvl>
+    <w:lvl w:ilvl="2" w:tentative="1">
+      <w:start w:val="1"/>
+      <w:numFmt w:val="bullet"/>
+      <w:lvlText w:val=""/>
+      <w:lvlJc w:val="left"/>
+      <w:pPr>
+        <w:tabs>
+          <w:tab w:val="num" w:pos="2160"/>
+        </w:tabs>
+        <w:ind w:left="2160" w:hanging="360"/>
+      </w:pPr>
+      <w:rPr>
+        <w:rFonts w:ascii="Wingdings" w:hAnsi="Wingdings" w:hint="default"/>
+        <w:sz w:val="20"/>
+      </w:rPr>
+    </w:lvl>
+    <w:lvl w:ilvl="3" w:tentative="1">
+      <w:start w:val="1"/>
+      <w:numFmt w:val="bullet"/>
+      <w:lvlText w:val=""/>
+      <w:lvlJc w:val="left"/>
+      <w:pPr>
+        <w:tabs>
+          <w:tab w:val="num" w:pos="2880"/>
+        </w:tabs>
+        <w:ind w:left="2880" w:hanging="360"/>
+      </w:pPr>
+      <w:rPr>
+        <w:rFonts w:ascii="Wingdings" w:hAnsi="Wingdings" w:hint="default"/>
+        <w:sz w:val="20"/>
+      </w:rPr>
+    </w:lvl>
+    <w:lvl w:ilvl="4" w:tentative="1">
+      <w:start w:val="1"/>
+      <w:numFmt w:val="bullet"/>
+      <w:lvlText w:val=""/>
+      <w:lvlJc w:val="left"/>
+      <w:pPr>
+        <w:tabs>
+          <w:tab w:val="num" w:pos="3600"/>
+        </w:tabs>
+        <w:ind w:left="3600" w:hanging="360"/>
+      </w:pPr>
+      <w:rPr>
+        <w:rFonts w:ascii="Wingdings" w:hAnsi="Wingdings" w:hint="default"/>
+        <w:sz w:val="20"/>
+      </w:rPr>
+    </w:lvl>
+    <w:lvl w:ilvl="5" w:tentative="1">
+      <w:start w:val="1"/>
+      <w:numFmt w:val="bullet"/>
+      <w:lvlText w:val=""/>
+      <w:lvlJc w:val="left"/>
+      <w:pPr>
+        <w:tabs>
+          <w:tab w:val="num" w:pos="4320"/>
+        </w:tabs>
+        <w:ind w:left="4320" w:hanging="360"/>
+      </w:pPr>
+      <w:rPr>
+        <w:rFonts w:ascii="Wingdings" w:hAnsi="Wingdings" w:hint="default"/>
+        <w:sz w:val="20"/>
+      </w:rPr>
+    </w:lvl>
+    <w:lvl w:ilvl="6" w:tentative="1">
+      <w:start w:val="1"/>
+      <w:numFmt w:val="bullet"/>
+      <w:lvlText w:val=""/>
+      <w:lvlJc w:val="left"/>
+      <w:pPr>
+        <w:tabs>
+          <w:tab w:val="num" w:pos="5040"/>
+        </w:tabs>
+        <w:ind w:left="5040" w:hanging="360"/>
+      </w:pPr>
+      <w:rPr>
+        <w:rFonts w:ascii="Wingdings" w:hAnsi="Wingdings" w:hint="default"/>
+        <w:sz w:val="20"/>
+      </w:rPr>
+    </w:lvl>
+    <w:lvl w:ilvl="7" w:tentative="1">
+      <w:start w:val="1"/>
+      <w:numFmt w:val="bullet"/>
+      <w:lvlText w:val=""/>
+      <w:lvlJc w:val="left"/>
+      <w:pPr>
+        <w:tabs>
+          <w:tab w:val="num" w:pos="5760"/>
+        </w:tabs>
+        <w:ind w:left="5760" w:hanging="360"/>
+      </w:pPr>
+      <w:rPr>
+        <w:rFonts w:ascii="Wingdings" w:hAnsi="Wingdings" w:hint="default"/>
+        <w:sz w:val="20"/>
+      </w:rPr>
+    </w:lvl>
+    <w:lvl w:ilvl="8" w:tentative="1">
+      <w:start w:val="1"/>
+      <w:numFmt w:val="bullet"/>
+      <w:lvlText w:val=""/>
+      <w:lvlJc w:val="left"/>
+      <w:pPr>
+        <w:tabs>
+          <w:tab w:val="num" w:pos="6480"/>
+        </w:tabs>
+        <w:ind w:left="6480" w:hanging="360"/>
+      </w:pPr>
+      <w:rPr>
+        <w:rFonts w:ascii="Wingdings" w:hAnsi="Wingdings" w:hint="default"/>
+        <w:sz w:val="20"/>
+      </w:rPr>
+    </w:lvl>
+  </w:abstractNum>
+  <w:abstractNum w:abstractNumId="4" w15:restartNumberingAfterBreak="0">
+    <w:nsid w:val="7F3D1AD9"/>
+    <w:multiLevelType w:val="multilevel"/>
+    <w:tmpl w:val="403EEBB2"/>
+    <w:lvl w:ilvl="0">
+      <w:start w:val="1"/>
+      <w:numFmt w:val="decimal"/>
+      <w:lvlText w:val="%1."/>
+      <w:lvlJc w:val="left"/>
+      <w:pPr>
+        <w:tabs>
+          <w:tab w:val="num" w:pos="720"/>
+        </w:tabs>
+        <w:ind w:left="720" w:hanging="360"/>
+      </w:pPr>
+    </w:lvl>
+    <w:lvl w:ilvl="1" w:tentative="1">
+      <w:start w:val="1"/>
+      <w:numFmt w:val="decimal"/>
+      <w:lvlText w:val="%2."/>
+      <w:lvlJc w:val="left"/>
+      <w:pPr>
+        <w:tabs>
+          <w:tab w:val="num" w:pos="1440"/>
+        </w:tabs>
+        <w:ind w:left="1440" w:hanging="360"/>
+      </w:pPr>
+    </w:lvl>
+    <w:lvl w:ilvl="2" w:tentative="1">
+      <w:start w:val="1"/>
+      <w:numFmt w:val="decimal"/>
+      <w:lvlText w:val="%3."/>
+      <w:lvlJc w:val="left"/>
+      <w:pPr>
+        <w:tabs>
+          <w:tab w:val="num" w:pos="2160"/>
+        </w:tabs>
+        <w:ind w:left="2160" w:hanging="360"/>
+      </w:pPr>
+    </w:lvl>
+    <w:lvl w:ilvl="3" w:tentative="1">
+      <w:start w:val="1"/>
+      <w:numFmt w:val="decimal"/>
+      <w:lvlText w:val="%4."/>
+      <w:lvlJc w:val="left"/>
+      <w:pPr>
+        <w:tabs>
+          <w:tab w:val="num" w:pos="2880"/>
+        </w:tabs>
+        <w:ind w:left="2880" w:hanging="360"/>
+      </w:pPr>
+    </w:lvl>
+    <w:lvl w:ilvl="4" w:tentative="1">
+      <w:start w:val="1"/>
+      <w:numFmt w:val="decimal"/>
+      <w:lvlText w:val="%5."/>
+      <w:lvlJc w:val="left"/>
+      <w:pPr>
+        <w:tabs>
+          <w:tab w:val="num" w:pos="3600"/>
+        </w:tabs>
+        <w:ind w:left="3600" w:hanging="360"/>
+      </w:pPr>
+    </w:lvl>
+    <w:lvl w:ilvl="5" w:tentative="1">
+      <w:start w:val="1"/>
+      <w:numFmt w:val="decimal"/>
+      <w:lvlText w:val="%6."/>
+      <w:lvlJc w:val="left"/>
+      <w:pPr>
+        <w:tabs>
+          <w:tab w:val="num" w:pos="4320"/>
+        </w:tabs>
+        <w:ind w:left="4320" w:hanging="360"/>
+      </w:pPr>
+    </w:lvl>
+    <w:lvl w:ilvl="6" w:tentative="1">
+      <w:start w:val="1"/>
+      <w:numFmt w:val="decimal"/>
+      <w:lvlText w:val="%7."/>
+      <w:lvlJc w:val="left"/>
+      <w:pPr>
+        <w:tabs>
+          <w:tab w:val="num" w:pos="5040"/>
+        </w:tabs>
+        <w:ind w:left="5040" w:hanging="360"/>
+      </w:pPr>
+    </w:lvl>
+    <w:lvl w:ilvl="7" w:tentative="1">
+      <w:start w:val="1"/>
+      <w:numFmt w:val="decimal"/>
+      <w:lvlText w:val="%8."/>
+      <w:lvlJc w:val="left"/>
+      <w:pPr>
+        <w:tabs>
+          <w:tab w:val="num" w:pos="5760"/>
+        </w:tabs>
+        <w:ind w:left="5760" w:hanging="360"/>
+      </w:pPr>
+    </w:lvl>
+    <w:lvl w:ilvl="8" w:tentative="1">
+      <w:start w:val="1"/>
+      <w:numFmt w:val="decimal"/>
+      <w:lvlText w:val="%9."/>
+      <w:lvlJc w:val="left"/>
+      <w:pPr>
+        <w:tabs>
+          <w:tab w:val="num" w:pos="6480"/>
+        </w:tabs>
+        <w:ind w:left="6480" w:hanging="360"/>
+      </w:pPr>
+    </w:lvl>
+  </w:abstractNum>
+  <w:num w:numId="1" w16cid:durableId="1662929584">
+    <w:abstractNumId w:val="3"/>
+  </w:num>
+  <w:num w:numId="2" w16cid:durableId="1446776197">
+    <w:abstractNumId w:val="4"/>
+  </w:num>
+  <w:num w:numId="3" w16cid:durableId="637147498">
+    <w:abstractNumId w:val="2"/>
+  </w:num>
+  <w:num w:numId="4" w16cid:durableId="1151487952">
+    <w:abstractNumId w:val="1"/>
+  </w:num>
+  <w:num w:numId="5" w16cid:durableId="1505585543">
     <w:abstractNumId w:val="0"/>
   </w:num>
 </w:numbering>
@@ -630,7 +1961,7 @@
     <w:lsdException w:name="Normal" w:uiPriority="0" w:qFormat="1"/>
     <w:lsdException w:name="heading 1" w:uiPriority="9" w:qFormat="1"/>
     <w:lsdException w:name="heading 2" w:uiPriority="9" w:qFormat="1"/>
-    <w:lsdException w:name="heading 3" w:semiHidden="1" w:uiPriority="9" w:unhideWhenUsed="1" w:qFormat="1"/>
+    <w:lsdException w:name="heading 3" w:uiPriority="9" w:qFormat="1"/>
     <w:lsdException w:name="heading 4" w:semiHidden="1" w:uiPriority="9" w:unhideWhenUsed="1" w:qFormat="1"/>
     <w:lsdException w:name="heading 5" w:semiHidden="1" w:uiPriority="9" w:unhideWhenUsed="1" w:qFormat="1"/>
     <w:lsdException w:name="heading 6" w:semiHidden="1" w:uiPriority="9" w:unhideWhenUsed="1" w:qFormat="1"/>
@@ -1020,12 +2351,16 @@
     <w:uiPriority w:val="9"/>
     <w:qFormat/>
     <w:pPr>
+      <w:pBdr>
+        <w:bottom w:val="single" w:sz="12" w:space="8" w:color="3498DB"/>
+      </w:pBdr>
       <w:spacing w:before="100" w:beforeAutospacing="1" w:after="100" w:afterAutospacing="1"/>
       <w:outlineLvl w:val="0"/>
     </w:pPr>
     <w:rPr>
       <w:b/>
       <w:bCs/>
+      <w:color w:val="2C3E50"/>
       <w:kern w:val="36"/>
       <w:sz w:val="48"/>
       <w:szCs w:val="48"/>
@@ -1038,14 +2373,33 @@
     <w:uiPriority w:val="9"/>
     <w:qFormat/>
     <w:pPr>
-      <w:spacing w:before="100" w:beforeAutospacing="1" w:after="100" w:afterAutospacing="1"/>
+      <w:spacing w:before="450" w:after="100" w:afterAutospacing="1"/>
       <w:outlineLvl w:val="1"/>
     </w:pPr>
     <w:rPr>
       <w:b/>
       <w:bCs/>
+      <w:color w:val="2980B9"/>
       <w:sz w:val="36"/>
       <w:szCs w:val="36"/>
+    </w:rPr>
+  </w:style>
+  <w:style w:type="paragraph" w:styleId="Ttulo3">
+    <w:name w:val="heading 3"/>
+    <w:basedOn w:val="Normal"/>
+    <w:link w:val="Ttulo3Car"/>
+    <w:uiPriority w:val="9"/>
+    <w:qFormat/>
+    <w:pPr>
+      <w:spacing w:before="100" w:beforeAutospacing="1" w:after="100" w:afterAutospacing="1"/>
+      <w:outlineLvl w:val="2"/>
+    </w:pPr>
+    <w:rPr>
+      <w:b/>
+      <w:bCs/>
+      <w:color w:val="16A085"/>
+      <w:sz w:val="27"/>
+      <w:szCs w:val="27"/>
     </w:rPr>
   </w:style>
   <w:style w:type="character" w:default="1" w:styleId="Fuentedeprrafopredeter">
@@ -1075,12 +2429,21 @@
     <w:semiHidden/>
     <w:unhideWhenUsed/>
   </w:style>
-  <w:style w:type="paragraph" w:customStyle="1" w:styleId="msonormal0">
-    <w:name w:val="msonormal"/>
-    <w:basedOn w:val="Normal"/>
-    <w:pPr>
-      <w:spacing w:before="100" w:beforeAutospacing="1" w:after="100" w:afterAutospacing="1"/>
-    </w:pPr>
+  <w:style w:type="character" w:styleId="CdigoHTML">
+    <w:name w:val="HTML Code"/>
+    <w:basedOn w:val="Fuentedeprrafopredeter"/>
+    <w:uiPriority w:val="99"/>
+    <w:semiHidden/>
+    <w:unhideWhenUsed/>
+    <w:rPr>
+      <w:rFonts w:ascii="Courier New" w:eastAsiaTheme="minorEastAsia" w:hAnsi="Courier New" w:cs="Courier New"/>
+      <w:b/>
+      <w:bCs/>
+      <w:color w:val="C0392B"/>
+      <w:sz w:val="20"/>
+      <w:szCs w:val="20"/>
+      <w:shd w:val="clear" w:color="auto" w:fill="F4F4F4"/>
+    </w:rPr>
   </w:style>
   <w:style w:type="character" w:customStyle="1" w:styleId="Ttulo1Car">
     <w:name w:val="Título 1 Car"/>
@@ -1092,6 +2455,100 @@
       <w:color w:val="0F4761" w:themeColor="accent1" w:themeShade="BF"/>
       <w:sz w:val="40"/>
       <w:szCs w:val="40"/>
+    </w:rPr>
+  </w:style>
+  <w:style w:type="character" w:customStyle="1" w:styleId="Ttulo2Car">
+    <w:name w:val="Título 2 Car"/>
+    <w:basedOn w:val="Fuentedeprrafopredeter"/>
+    <w:link w:val="Ttulo2"/>
+    <w:uiPriority w:val="9"/>
+    <w:semiHidden/>
+    <w:rPr>
+      <w:rFonts w:asciiTheme="majorHAnsi" w:eastAsiaTheme="majorEastAsia" w:hAnsiTheme="majorHAnsi" w:cstheme="majorBidi"/>
+      <w:color w:val="0F4761" w:themeColor="accent1" w:themeShade="BF"/>
+      <w:sz w:val="32"/>
+      <w:szCs w:val="32"/>
+    </w:rPr>
+  </w:style>
+  <w:style w:type="character" w:customStyle="1" w:styleId="Ttulo3Car">
+    <w:name w:val="Título 3 Car"/>
+    <w:basedOn w:val="Fuentedeprrafopredeter"/>
+    <w:link w:val="Ttulo3"/>
+    <w:uiPriority w:val="9"/>
+    <w:semiHidden/>
+    <w:rPr>
+      <w:rFonts w:asciiTheme="minorHAnsi" w:eastAsiaTheme="majorEastAsia" w:hAnsiTheme="minorHAnsi" w:cstheme="majorBidi"/>
+      <w:color w:val="0F4761" w:themeColor="accent1" w:themeShade="BF"/>
+      <w:sz w:val="28"/>
+      <w:szCs w:val="28"/>
+    </w:rPr>
+  </w:style>
+  <w:style w:type="paragraph" w:styleId="HTMLconformatoprevio">
+    <w:name w:val="HTML Preformatted"/>
+    <w:basedOn w:val="Normal"/>
+    <w:link w:val="HTMLconformatoprevioCar"/>
+    <w:uiPriority w:val="99"/>
+    <w:semiHidden/>
+    <w:unhideWhenUsed/>
+    <w:pPr>
+      <w:pBdr>
+        <w:left w:val="single" w:sz="24" w:space="11" w:color="E74C3C"/>
+      </w:pBdr>
+      <w:shd w:val="clear" w:color="auto" w:fill="F4F4F4"/>
+      <w:tabs>
+        <w:tab w:val="left" w:pos="916"/>
+        <w:tab w:val="left" w:pos="1832"/>
+        <w:tab w:val="left" w:pos="2748"/>
+        <w:tab w:val="left" w:pos="3664"/>
+        <w:tab w:val="left" w:pos="4580"/>
+        <w:tab w:val="left" w:pos="5496"/>
+        <w:tab w:val="left" w:pos="6412"/>
+        <w:tab w:val="left" w:pos="7328"/>
+        <w:tab w:val="left" w:pos="8244"/>
+        <w:tab w:val="left" w:pos="9160"/>
+        <w:tab w:val="left" w:pos="10076"/>
+        <w:tab w:val="left" w:pos="10992"/>
+        <w:tab w:val="left" w:pos="11908"/>
+        <w:tab w:val="left" w:pos="12824"/>
+        <w:tab w:val="left" w:pos="13740"/>
+        <w:tab w:val="left" w:pos="14656"/>
+      </w:tabs>
+    </w:pPr>
+    <w:rPr>
+      <w:rFonts w:ascii="Consolas" w:hAnsi="Consolas" w:cs="Courier New"/>
+      <w:sz w:val="20"/>
+      <w:szCs w:val="20"/>
+    </w:rPr>
+  </w:style>
+  <w:style w:type="character" w:customStyle="1" w:styleId="HTMLconformatoprevioCar">
+    <w:name w:val="HTML con formato previo Car"/>
+    <w:basedOn w:val="Fuentedeprrafopredeter"/>
+    <w:link w:val="HTMLconformatoprevio"/>
+    <w:uiPriority w:val="99"/>
+    <w:semiHidden/>
+    <w:rPr>
+      <w:rFonts w:ascii="Consolas" w:eastAsiaTheme="minorEastAsia" w:hAnsi="Consolas"/>
+    </w:rPr>
+  </w:style>
+  <w:style w:type="paragraph" w:customStyle="1" w:styleId="msonormal0">
+    <w:name w:val="msonormal"/>
+    <w:basedOn w:val="Normal"/>
+    <w:pPr>
+      <w:spacing w:before="100" w:beforeAutospacing="1" w:after="100" w:afterAutospacing="1"/>
+    </w:pPr>
+  </w:style>
+  <w:style w:type="paragraph" w:customStyle="1" w:styleId="alert">
+    <w:name w:val="alert"/>
+    <w:basedOn w:val="Normal"/>
+    <w:pPr>
+      <w:pBdr>
+        <w:left w:val="single" w:sz="36" w:space="11" w:color="FFEEBA"/>
+      </w:pBdr>
+      <w:shd w:val="clear" w:color="auto" w:fill="FFF3CD"/>
+      <w:spacing w:before="300" w:after="300"/>
+    </w:pPr>
+    <w:rPr>
+      <w:color w:val="856404"/>
     </w:rPr>
   </w:style>
   <w:style w:type="paragraph" w:styleId="NormalWeb">
@@ -1112,74 +2569,6 @@
     <w:rPr>
       <w:b/>
       <w:bCs/>
-    </w:rPr>
-  </w:style>
-  <w:style w:type="character" w:customStyle="1" w:styleId="Ttulo2Car">
-    <w:name w:val="Título 2 Car"/>
-    <w:basedOn w:val="Fuentedeprrafopredeter"/>
-    <w:link w:val="Ttulo2"/>
-    <w:uiPriority w:val="9"/>
-    <w:semiHidden/>
-    <w:rPr>
-      <w:rFonts w:asciiTheme="majorHAnsi" w:eastAsiaTheme="majorEastAsia" w:hAnsiTheme="majorHAnsi" w:cstheme="majorBidi"/>
-      <w:color w:val="0F4761" w:themeColor="accent1" w:themeShade="BF"/>
-      <w:sz w:val="32"/>
-      <w:szCs w:val="32"/>
-    </w:rPr>
-  </w:style>
-  <w:style w:type="character" w:styleId="CdigoHTML">
-    <w:name w:val="HTML Code"/>
-    <w:basedOn w:val="Fuentedeprrafopredeter"/>
-    <w:uiPriority w:val="99"/>
-    <w:semiHidden/>
-    <w:unhideWhenUsed/>
-    <w:rPr>
-      <w:rFonts w:ascii="Courier New" w:eastAsiaTheme="minorEastAsia" w:hAnsi="Courier New" w:cs="Courier New"/>
-      <w:sz w:val="20"/>
-      <w:szCs w:val="20"/>
-    </w:rPr>
-  </w:style>
-  <w:style w:type="paragraph" w:styleId="HTMLconformatoprevio">
-    <w:name w:val="HTML Preformatted"/>
-    <w:basedOn w:val="Normal"/>
-    <w:link w:val="HTMLconformatoprevioCar"/>
-    <w:uiPriority w:val="99"/>
-    <w:semiHidden/>
-    <w:unhideWhenUsed/>
-    <w:pPr>
-      <w:tabs>
-        <w:tab w:val="left" w:pos="916"/>
-        <w:tab w:val="left" w:pos="1832"/>
-        <w:tab w:val="left" w:pos="2748"/>
-        <w:tab w:val="left" w:pos="3664"/>
-        <w:tab w:val="left" w:pos="4580"/>
-        <w:tab w:val="left" w:pos="5496"/>
-        <w:tab w:val="left" w:pos="6412"/>
-        <w:tab w:val="left" w:pos="7328"/>
-        <w:tab w:val="left" w:pos="8244"/>
-        <w:tab w:val="left" w:pos="9160"/>
-        <w:tab w:val="left" w:pos="10076"/>
-        <w:tab w:val="left" w:pos="10992"/>
-        <w:tab w:val="left" w:pos="11908"/>
-        <w:tab w:val="left" w:pos="12824"/>
-        <w:tab w:val="left" w:pos="13740"/>
-        <w:tab w:val="left" w:pos="14656"/>
-      </w:tabs>
-    </w:pPr>
-    <w:rPr>
-      <w:rFonts w:ascii="Courier New" w:hAnsi="Courier New" w:cs="Courier New"/>
-      <w:sz w:val="20"/>
-      <w:szCs w:val="20"/>
-    </w:rPr>
-  </w:style>
-  <w:style w:type="character" w:customStyle="1" w:styleId="HTMLconformatoprevioCar">
-    <w:name w:val="HTML con formato previo Car"/>
-    <w:basedOn w:val="Fuentedeprrafopredeter"/>
-    <w:link w:val="HTMLconformatoprevio"/>
-    <w:uiPriority w:val="99"/>
-    <w:semiHidden/>
-    <w:rPr>
-      <w:rFonts w:ascii="Consolas" w:eastAsiaTheme="minorEastAsia" w:hAnsi="Consolas"/>
     </w:rPr>
   </w:style>
 </w:styles>

</xml_diff>

<commit_message>
Corrige la vista de auditoría y limpia rutas de CotizacionController
</commit_message>
<xml_diff>
--- a/GUIA_INSTALACION.docx
+++ b/GUIA_INSTALACION.docx
@@ -5,6 +5,97 @@
     <w:p>
       <w:pPr>
         <w:pStyle w:val="Ttulo1"/>
+        <w:ind w:left="600" w:firstLine="108"/>
+        <w:divId w:val="1408185825"/>
+        <w:rPr>
+          <w:rFonts w:ascii="Segoe UI" w:eastAsia="Times New Roman" w:hAnsi="Segoe UI" w:cs="Segoe UI"/>
+        </w:rPr>
+      </w:pPr>
+      <w:r>
+        <w:rPr>
+          <w:noProof/>
+          <w:sz w:val="24"/>
+          <w:szCs w:val="24"/>
+          <w:lang w:val="es-419" w:eastAsia="es-419"/>
+        </w:rPr>
+        <w:drawing>
+          <wp:anchor distT="0" distB="0" distL="114300" distR="114300" simplePos="0" relativeHeight="251659264" behindDoc="0" locked="0" layoutInCell="1" allowOverlap="1" wp14:anchorId="1D047BFB" wp14:editId="1129B2D4">
+            <wp:simplePos x="0" y="0"/>
+            <wp:positionH relativeFrom="margin">
+              <wp:align>center</wp:align>
+            </wp:positionH>
+            <wp:positionV relativeFrom="paragraph">
+              <wp:posOffset>0</wp:posOffset>
+            </wp:positionV>
+            <wp:extent cx="2240280" cy="1400175"/>
+            <wp:effectExtent l="0" t="0" r="7620" b="9525"/>
+            <wp:wrapSquare wrapText="bothSides"/>
+            <wp:docPr id="4" name="Imagen 4"/>
+            <wp:cNvGraphicFramePr>
+              <a:graphicFrameLocks xmlns:a="http://schemas.openxmlformats.org/drawingml/2006/main" noChangeAspect="1"/>
+            </wp:cNvGraphicFramePr>
+            <a:graphic xmlns:a="http://schemas.openxmlformats.org/drawingml/2006/main">
+              <a:graphicData uri="http://schemas.openxmlformats.org/drawingml/2006/picture">
+                <pic:pic xmlns:pic="http://schemas.openxmlformats.org/drawingml/2006/picture">
+                  <pic:nvPicPr>
+                    <pic:cNvPr id="0" name="Picture 4"/>
+                    <pic:cNvPicPr>
+                      <a:picLocks noChangeAspect="1" noChangeArrowheads="1"/>
+                    </pic:cNvPicPr>
+                  </pic:nvPicPr>
+                  <pic:blipFill>
+                    <a:blip r:embed="rId5">
+                      <a:extLst>
+                        <a:ext uri="{28A0092B-C50C-407E-A947-70E740481C1C}">
+                          <a14:useLocalDpi xmlns:a14="http://schemas.microsoft.com/office/drawing/2010/main" val="0"/>
+                        </a:ext>
+                      </a:extLst>
+                    </a:blip>
+                    <a:srcRect/>
+                    <a:stretch>
+                      <a:fillRect/>
+                    </a:stretch>
+                  </pic:blipFill>
+                  <pic:spPr bwMode="auto">
+                    <a:xfrm>
+                      <a:off x="0" y="0"/>
+                      <a:ext cx="2240280" cy="1400175"/>
+                    </a:xfrm>
+                    <a:prstGeom prst="rect">
+                      <a:avLst/>
+                    </a:prstGeom>
+                    <a:noFill/>
+                    <a:ln>
+                      <a:noFill/>
+                    </a:ln>
+                  </pic:spPr>
+                </pic:pic>
+              </a:graphicData>
+            </a:graphic>
+            <wp14:sizeRelH relativeFrom="page">
+              <wp14:pctWidth>0</wp14:pctWidth>
+            </wp14:sizeRelH>
+            <wp14:sizeRelV relativeFrom="page">
+              <wp14:pctHeight>0</wp14:pctHeight>
+            </wp14:sizeRelV>
+          </wp:anchor>
+        </w:drawing>
+      </w:r>
+    </w:p>
+    <w:p>
+      <w:pPr>
+        <w:pStyle w:val="Ttulo1"/>
+        <w:ind w:left="600" w:firstLine="108"/>
+        <w:divId w:val="1408185825"/>
+        <w:rPr>
+          <w:rFonts w:ascii="Segoe UI" w:eastAsia="Times New Roman" w:hAnsi="Segoe UI" w:cs="Segoe UI"/>
+        </w:rPr>
+      </w:pPr>
+    </w:p>
+    <w:p>
+      <w:pPr>
+        <w:pStyle w:val="Ttulo1"/>
+        <w:ind w:left="600" w:firstLine="108"/>
         <w:divId w:val="1408185825"/>
         <w:rPr>
           <w:rFonts w:ascii="Segoe UI" w:eastAsia="Times New Roman" w:hAnsi="Segoe UI" w:cs="Segoe UI"/>
@@ -265,6 +356,7 @@
           <w:rFonts w:ascii="Segoe UI" w:eastAsia="Times New Roman" w:hAnsi="Segoe UI" w:cs="Segoe UI"/>
           <w:color w:val="333333"/>
         </w:rPr>
+        <w:lastRenderedPageBreak/>
         <w:t xml:space="preserve">Copie la carpeta entera del proyecto (llamada </w:t>
       </w:r>
       <w:r>
@@ -278,7 +370,48 @@
           <w:rFonts w:ascii="Segoe UI" w:eastAsia="Times New Roman" w:hAnsi="Segoe UI" w:cs="Segoe UI"/>
           <w:color w:val="333333"/>
         </w:rPr>
-        <w:t xml:space="preserve">) y péguela dentro del directorio público de su servidor local. Si usa XAMPP, la ruta exacta debe ser: </w:t>
+        <w:t xml:space="preserve">) </w:t>
+      </w:r>
+      <w:r>
+        <w:rPr>
+          <w:rFonts w:ascii="Segoe UI" w:eastAsia="Times New Roman" w:hAnsi="Segoe UI" w:cs="Segoe UI"/>
+          <w:color w:val="333333"/>
+        </w:rPr>
+        <w:t xml:space="preserve">o también descárguela mediante mi repositorio de GitHub </w:t>
+      </w:r>
+      <w:hyperlink r:id="rId6" w:history="1">
+        <w:r>
+          <w:rPr>
+            <w:rStyle w:val="Hipervnculo"/>
+            <w:rFonts w:ascii="Segoe UI" w:eastAsia="Times New Roman" w:hAnsi="Segoe UI" w:cs="Segoe UI"/>
+          </w:rPr>
+          <w:t>https://github.com/Edson-git-web/unimaq-crm</w:t>
+        </w:r>
+      </w:hyperlink>
+    </w:p>
+    <w:p>
+      <w:pPr>
+        <w:spacing w:before="100" w:beforeAutospacing="1" w:after="120"/>
+        <w:ind w:left="720"/>
+        <w:divId w:val="1408185825"/>
+        <w:rPr>
+          <w:rFonts w:ascii="Segoe UI" w:eastAsia="Times New Roman" w:hAnsi="Segoe UI" w:cs="Segoe UI"/>
+          <w:color w:val="333333"/>
+        </w:rPr>
+      </w:pPr>
+      <w:r>
+        <w:rPr>
+          <w:rFonts w:ascii="Segoe UI" w:eastAsia="Times New Roman" w:hAnsi="Segoe UI" w:cs="Segoe UI"/>
+          <w:color w:val="333333"/>
+        </w:rPr>
+        <w:t xml:space="preserve">Y </w:t>
+      </w:r>
+      <w:r>
+        <w:rPr>
+          <w:rFonts w:ascii="Segoe UI" w:eastAsia="Times New Roman" w:hAnsi="Segoe UI" w:cs="Segoe UI"/>
+          <w:color w:val="333333"/>
+        </w:rPr>
+        <w:t xml:space="preserve">péguela dentro del directorio público de su servidor local. Si usa XAMPP, la ruta exacta debe ser: </w:t>
       </w:r>
       <w:r>
         <w:rPr>
@@ -349,7 +482,6 @@
           <w:rFonts w:ascii="Segoe UI" w:eastAsia="Times New Roman" w:hAnsi="Segoe UI" w:cs="Segoe UI"/>
           <w:color w:val="333333"/>
         </w:rPr>
-        <w:lastRenderedPageBreak/>
         <w:t xml:space="preserve">Ejecute el siguiente comando para descargar todas las librerías internas del framework Laravel (esto creará la carpeta </w:t>
       </w:r>
       <w:r>
@@ -617,14 +749,7 @@
           <w:rFonts w:ascii="Segoe UI" w:eastAsia="Times New Roman" w:hAnsi="Segoe UI" w:cs="Segoe UI"/>
           <w:color w:val="333333"/>
         </w:rPr>
-        <w:t xml:space="preserve"> </w:t>
-      </w:r>
-      <w:r>
-        <w:rPr>
-          <w:rFonts w:ascii="Segoe UI" w:eastAsia="Times New Roman" w:hAnsi="Segoe UI" w:cs="Segoe UI"/>
-          <w:color w:val="333333"/>
-        </w:rPr>
-        <w:t>(esto asegura que caracteres como la "ñ" y tildes se guarden correctamente).</w:t>
+        <w:t xml:space="preserve"> (esto asegura que caracteres como la "ñ" y tildes se guarden correctamente).</w:t>
       </w:r>
     </w:p>
     <w:p>
@@ -696,6 +821,7 @@
           <w:rFonts w:ascii="Segoe UI" w:eastAsia="Times New Roman" w:hAnsi="Segoe UI" w:cs="Segoe UI"/>
           <w:color w:val="333333"/>
         </w:rPr>
+        <w:lastRenderedPageBreak/>
         <w:t xml:space="preserve">Dentro de la carpeta del proyecto </w:t>
       </w:r>
       <w:r>
@@ -790,14 +916,7 @@
           <w:rFonts w:ascii="Segoe UI" w:eastAsia="Times New Roman" w:hAnsi="Segoe UI" w:cs="Segoe UI"/>
           <w:color w:val="333333"/>
         </w:rPr>
-        <w:t xml:space="preserve"> </w:t>
-      </w:r>
-      <w:r>
-        <w:rPr>
-          <w:rFonts w:ascii="Segoe UI" w:eastAsia="Times New Roman" w:hAnsi="Segoe UI" w:cs="Segoe UI"/>
-          <w:color w:val="333333"/>
-        </w:rPr>
-        <w:t xml:space="preserve">con cualquier editor de texto (como el Bloc de notas o VSCode) y busque la sección de base de datos. Configúrela de la siguiente manera para conectarse a la base de datos recién creada: </w:t>
+        <w:t xml:space="preserve"> con cualquier editor de texto (como el Bloc de notas o VSCode) y busque la sección de base de datos. Configúrela de la siguiente manera para conectarse a la base de datos recién creada: </w:t>
       </w:r>
     </w:p>
     <w:p>
@@ -885,7 +1004,6 @@
         <w:rPr>
           <w:rStyle w:val="CdigoHTML"/>
         </w:rPr>
-        <w:lastRenderedPageBreak/>
         <w:t>DB_DATABASE=unimaq_crm_db</w:t>
       </w:r>
     </w:p>
@@ -1126,6 +1244,7 @@
           <w:rFonts w:ascii="Segoe UI" w:eastAsia="Times New Roman" w:hAnsi="Segoe UI" w:cs="Segoe UI"/>
           <w:color w:val="856404"/>
         </w:rPr>
+        <w:lastRenderedPageBreak/>
         <w:t>Credenciales Generadas Automáticamente:</w:t>
       </w:r>
       <w:r>
@@ -2571,6 +2690,29 @@
       <w:bCs/>
     </w:rPr>
   </w:style>
+  <w:style w:type="character" w:styleId="Hipervnculo">
+    <w:name w:val="Hyperlink"/>
+    <w:basedOn w:val="Fuentedeprrafopredeter"/>
+    <w:uiPriority w:val="99"/>
+    <w:unhideWhenUsed/>
+    <w:rsid w:val="0069122E"/>
+    <w:rPr>
+      <w:color w:val="467886" w:themeColor="hyperlink"/>
+      <w:u w:val="single"/>
+    </w:rPr>
+  </w:style>
+  <w:style w:type="character" w:styleId="Mencinsinresolver">
+    <w:name w:val="Unresolved Mention"/>
+    <w:basedOn w:val="Fuentedeprrafopredeter"/>
+    <w:uiPriority w:val="99"/>
+    <w:semiHidden/>
+    <w:unhideWhenUsed/>
+    <w:rsid w:val="0069122E"/>
+    <w:rPr>
+      <w:color w:val="605E5C"/>
+      <w:shd w:val="clear" w:color="auto" w:fill="E1DFDD"/>
+    </w:rPr>
+  </w:style>
 </w:styles>
 </file>
 

</xml_diff>